<commit_message>
Update Pre projeto - Atualizado.docx
Correções finais
</commit_message>
<xml_diff>
--- a/Pre projeto - Atualizado.docx
+++ b/Pre projeto - Atualizado.docx
@@ -926,6 +926,17 @@
       </w:r>
     </w:p>
     <w:p>
+      <w:pPr>
+        <w:spacing w:before="0" w:after="0"/>
+        <w:jc w:val="center"/>
+        <w:rPr>
+          <w:rFonts w:asciiTheme="majorHAnsi" w:hAnsiTheme="majorHAnsi" w:cstheme="majorHAnsi"/>
+          <w:b/>
+          <w:sz w:val="28"/>
+        </w:rPr>
+      </w:pPr>
+    </w:p>
+    <w:p>
       <w:r>
         <w:t xml:space="preserve">O estágio representa um momento indispensável na formação acadêmica dos estudantes do ensino técnico e superior, sendo determinante para o desenvolvimento de competências profissionais. No IFNMG – Campus Arinos, observa-se que os alunos enfrentam dificuldades </w:t>
       </w:r>
@@ -1026,15 +1037,79 @@
       </w:r>
     </w:p>
     <w:p>
-      <w:r>
+      <w:pPr>
         <w:rPr>
           <w:b/>
           <w:bCs/>
         </w:rPr>
+      </w:pPr>
+    </w:p>
+    <w:p>
+      <w:pPr>
+        <w:rPr>
+          <w:b/>
+          <w:bCs/>
+        </w:rPr>
+      </w:pPr>
+    </w:p>
+    <w:p>
+      <w:pPr>
+        <w:rPr>
+          <w:b/>
+          <w:bCs/>
+        </w:rPr>
+      </w:pPr>
+    </w:p>
+    <w:p>
+      <w:pPr>
+        <w:rPr>
+          <w:b/>
+          <w:bCs/>
+        </w:rPr>
+      </w:pPr>
+    </w:p>
+    <w:p>
+      <w:pPr>
+        <w:rPr>
+          <w:b/>
+          <w:bCs/>
+        </w:rPr>
+      </w:pPr>
+    </w:p>
+    <w:p>
+      <w:pPr>
+        <w:rPr>
+          <w:b/>
+          <w:bCs/>
+        </w:rPr>
+      </w:pPr>
+    </w:p>
+    <w:p>
+      <w:pPr>
+        <w:rPr>
+          <w:b/>
+          <w:bCs/>
+        </w:rPr>
+      </w:pPr>
+    </w:p>
+    <w:p>
+      <w:r>
+        <w:rPr>
+          <w:b/>
+          <w:bCs/>
+        </w:rPr>
         <w:t>Palavras-chaves</w:t>
       </w:r>
       <w:r>
-        <w:t xml:space="preserve">: Estágio; Design Thinking; </w:t>
+        <w:t xml:space="preserve">: Estágio; Design </w:t>
+      </w:r>
+      <w:proofErr w:type="spellStart"/>
+      <w:r>
+        <w:t>Thinking</w:t>
+      </w:r>
+      <w:proofErr w:type="spellEnd"/>
+      <w:r>
+        <w:t xml:space="preserve">; </w:t>
       </w:r>
       <w:r>
         <w:t>p</w:t>
@@ -1053,6 +1128,11 @@
     </w:p>
     <w:p>
       <w:pPr>
+        <w:tabs>
+          <w:tab w:val="clear" w:pos="709"/>
+        </w:tabs>
+        <w:spacing w:before="0" w:after="0" w:line="240" w:lineRule="auto"/>
+        <w:jc w:val="left"/>
         <w:rPr>
           <w:rStyle w:val="apple-style-span"/>
           <w:rFonts w:asciiTheme="majorHAnsi" w:hAnsiTheme="majorHAnsi" w:cstheme="majorHAnsi"/>
@@ -1061,8 +1141,49 @@
           <w:shd w:val="clear" w:color="auto" w:fill="FFFFFF"/>
         </w:rPr>
       </w:pPr>
+      <w:r>
+        <w:rPr>
+          <w:rStyle w:val="apple-style-span"/>
+          <w:rFonts w:asciiTheme="majorHAnsi" w:hAnsiTheme="majorHAnsi" w:cstheme="majorHAnsi"/>
+          <w:b/>
+          <w:color w:val="000000"/>
+          <w:shd w:val="clear" w:color="auto" w:fill="FFFFFF"/>
+        </w:rPr>
+        <w:br w:type="page"/>
+      </w:r>
     </w:p>
     <w:bookmarkEnd w:id="0"/>
+    <w:p>
+      <w:pPr>
+        <w:spacing w:before="0" w:after="0" w:line="240" w:lineRule="auto"/>
+        <w:jc w:val="left"/>
+        <w:rPr>
+          <w:b/>
+          <w:bCs/>
+          <w:lang w:val="en-US"/>
+        </w:rPr>
+      </w:pPr>
+      <w:r>
+        <w:rPr>
+          <w:rStyle w:val="apple-style-span"/>
+          <w:rFonts w:asciiTheme="majorHAnsi" w:hAnsiTheme="majorHAnsi" w:cstheme="majorHAnsi"/>
+          <w:b/>
+          <w:bCs/>
+          <w:color w:val="000000"/>
+          <w:shd w:val="clear" w:color="auto" w:fill="FFFFFF"/>
+        </w:rPr>
+        <w:lastRenderedPageBreak/>
+        <w:t xml:space="preserve">                                                         </w:t>
+      </w:r>
+      <w:r>
+        <w:rPr>
+          <w:b/>
+          <w:bCs/>
+          <w:lang w:val="en-US"/>
+        </w:rPr>
+        <w:t>ABSTRACT</w:t>
+      </w:r>
+    </w:p>
     <w:p>
       <w:pPr>
         <w:spacing w:before="0" w:after="0" w:line="240" w:lineRule="auto"/>
@@ -1076,25 +1197,6 @@
           <w:lang w:val="en-US"/>
         </w:rPr>
       </w:pPr>
-      <w:r>
-        <w:rPr>
-          <w:rStyle w:val="apple-style-span"/>
-          <w:rFonts w:asciiTheme="majorHAnsi" w:hAnsiTheme="majorHAnsi" w:cstheme="majorHAnsi"/>
-          <w:b/>
-          <w:bCs/>
-          <w:color w:val="000000"/>
-          <w:shd w:val="clear" w:color="auto" w:fill="FFFFFF"/>
-        </w:rPr>
-        <w:t xml:space="preserve">                                                         </w:t>
-      </w:r>
-      <w:r>
-        <w:rPr>
-          <w:b/>
-          <w:bCs/>
-          <w:lang w:val="en-US"/>
-        </w:rPr>
-        <w:t>ABSTRACT</w:t>
-      </w:r>
     </w:p>
     <w:p>
       <w:pPr>
@@ -1121,31 +1223,21 @@
           <w:lang w:val="en-US"/>
         </w:rPr>
       </w:pPr>
-    </w:p>
-    <w:p>
-      <w:pPr>
+      <w:r>
         <w:rPr>
           <w:rFonts w:asciiTheme="majorHAnsi" w:hAnsiTheme="majorHAnsi" w:cstheme="majorHAnsi"/>
           <w:color w:val="000000" w:themeColor="text1"/>
           <w:lang w:val="en-US"/>
         </w:rPr>
-      </w:pPr>
+        <w:tab/>
+      </w:r>
       <w:r>
         <w:rPr>
           <w:rFonts w:asciiTheme="majorHAnsi" w:hAnsiTheme="majorHAnsi" w:cstheme="majorHAnsi"/>
           <w:color w:val="000000" w:themeColor="text1"/>
           <w:lang w:val="en-US"/>
         </w:rPr>
-        <w:t xml:space="preserve">Given this deficiency, this work proposes the development of a prototype for a platform to disseminate internship opportunities, applying the Design Thinking approach. Through this, it is expected to understand the needs of students and create an intuitive and functional interface, considering the profile of the courses offered. Among the planned functionalities are registration, dissemination of vacancies and management </w:t>
-      </w:r>
-      <w:r>
-        <w:rPr>
-          <w:rFonts w:asciiTheme="majorHAnsi" w:hAnsiTheme="majorHAnsi" w:cstheme="majorHAnsi"/>
-          <w:color w:val="000000" w:themeColor="text1"/>
-          <w:lang w:val="en-US"/>
-        </w:rPr>
-        <w:lastRenderedPageBreak/>
-        <w:t>of user information; with the aim of making the search for opportunities simpler, more accessible and reliable.</w:t>
+        <w:t>Given this deficiency, this work proposes the development of a prototype for a platform to disseminate internship opportunities, applying the Design Thinking approach. Through this, it is expected to understand the needs of students and create an intuitive and functional interface, considering the profile of the courses offered. Among the planned functionalities are registration, dissemination of vacancies and management of user information; with the aim of making the search for opportunities simpler, more accessible and reliable.</w:t>
       </w:r>
     </w:p>
     <w:p>
@@ -1168,8 +1260,11 @@
     </w:p>
     <w:p>
       <w:pPr>
+        <w:tabs>
+          <w:tab w:val="clear" w:pos="709"/>
+        </w:tabs>
         <w:spacing w:before="0" w:after="0" w:line="240" w:lineRule="auto"/>
-        <w:jc w:val="center"/>
+        <w:jc w:val="left"/>
         <w:rPr>
           <w:rStyle w:val="apple-style-span"/>
           <w:rFonts w:asciiTheme="majorHAnsi" w:hAnsiTheme="majorHAnsi" w:cstheme="majorHAnsi"/>
@@ -1180,36 +1275,7 @@
           <w:lang w:val="en-US"/>
         </w:rPr>
       </w:pPr>
-    </w:p>
-    <w:p>
-      <w:pPr>
-        <w:spacing w:before="0" w:after="0" w:line="240" w:lineRule="auto"/>
-        <w:jc w:val="center"/>
-        <w:rPr>
-          <w:rStyle w:val="apple-style-span"/>
-          <w:rFonts w:cstheme="majorHAnsi"/>
-          <w:b/>
-          <w:bCs/>
-          <w:color w:val="000000"/>
-          <w:shd w:val="clear" w:color="auto" w:fill="FFFFFF"/>
-        </w:rPr>
-      </w:pPr>
-      <w:r>
-        <w:rPr>
-          <w:rStyle w:val="apple-style-span"/>
-          <w:rFonts w:cstheme="majorHAnsi"/>
-          <w:b/>
-          <w:bCs/>
-          <w:color w:val="000000"/>
-          <w:shd w:val="clear" w:color="auto" w:fill="FFFFFF"/>
-        </w:rPr>
-        <w:t>LISTA DE FIGURAS</w:t>
-      </w:r>
-    </w:p>
-    <w:p>
-      <w:pPr>
-        <w:spacing w:before="0" w:after="0" w:line="240" w:lineRule="auto"/>
-        <w:jc w:val="center"/>
+      <w:r>
         <w:rPr>
           <w:rStyle w:val="apple-style-span"/>
           <w:rFonts w:asciiTheme="majorHAnsi" w:hAnsiTheme="majorHAnsi" w:cstheme="majorHAnsi"/>
@@ -1219,6 +1285,48 @@
           <w:shd w:val="clear" w:color="auto" w:fill="FFFFFF"/>
           <w:lang w:val="en-US"/>
         </w:rPr>
+        <w:br w:type="page"/>
+      </w:r>
+    </w:p>
+    <w:p>
+      <w:pPr>
+        <w:spacing w:before="0" w:after="0" w:line="240" w:lineRule="auto"/>
+        <w:jc w:val="center"/>
+        <w:rPr>
+          <w:rStyle w:val="apple-style-span"/>
+          <w:rFonts w:cstheme="majorHAnsi"/>
+          <w:b/>
+          <w:bCs/>
+          <w:color w:val="000000"/>
+          <w:shd w:val="clear" w:color="auto" w:fill="FFFFFF"/>
+        </w:rPr>
+      </w:pPr>
+      <w:r>
+        <w:rPr>
+          <w:rStyle w:val="apple-style-span"/>
+          <w:rFonts w:cstheme="majorHAnsi"/>
+          <w:b/>
+          <w:bCs/>
+          <w:color w:val="000000"/>
+          <w:shd w:val="clear" w:color="auto" w:fill="FFFFFF"/>
+        </w:rPr>
+        <w:lastRenderedPageBreak/>
+        <w:t>LISTA DE FIGURAS</w:t>
+      </w:r>
+    </w:p>
+    <w:p>
+      <w:pPr>
+        <w:spacing w:before="0" w:after="0" w:line="240" w:lineRule="auto"/>
+        <w:jc w:val="center"/>
+        <w:rPr>
+          <w:rStyle w:val="apple-style-span"/>
+          <w:rFonts w:asciiTheme="majorHAnsi" w:hAnsiTheme="majorHAnsi" w:cstheme="majorHAnsi"/>
+          <w:b/>
+          <w:bCs/>
+          <w:color w:val="000000"/>
+          <w:shd w:val="clear" w:color="auto" w:fill="FFFFFF"/>
+          <w:lang w:val="en-US"/>
+        </w:rPr>
       </w:pPr>
     </w:p>
     <w:p>
@@ -1241,7 +1349,7 @@
       <w:r>
         <w:fldChar w:fldCharType="separate"/>
       </w:r>
-      <w:hyperlink w:anchor="_Toc210140249" w:history="1">
+      <w:hyperlink w:anchor="_Toc213681845" w:history="1">
         <w:r>
           <w:rPr>
             <w:rStyle w:val="Hyperlink"/>
@@ -1268,7 +1376,7 @@
             <w:noProof/>
             <w:webHidden/>
           </w:rPr>
-          <w:instrText xml:space="preserve"> PAGEREF _Toc210140249 \h </w:instrText>
+          <w:instrText xml:space="preserve"> PAGEREF _Toc213681845 \h </w:instrText>
         </w:r>
         <w:r>
           <w:rPr>
@@ -1310,7 +1418,7 @@
           <w14:ligatures w14:val="standardContextual"/>
         </w:rPr>
       </w:pPr>
-      <w:hyperlink w:anchor="_Toc210140250" w:history="1">
+      <w:hyperlink w:anchor="_Toc213681846" w:history="1">
         <w:r>
           <w:rPr>
             <w:rStyle w:val="Hyperlink"/>
@@ -1337,7 +1445,7 @@
             <w:noProof/>
             <w:webHidden/>
           </w:rPr>
-          <w:instrText xml:space="preserve"> PAGEREF _Toc210140250 \h </w:instrText>
+          <w:instrText xml:space="preserve"> PAGEREF _Toc213681846 \h </w:instrText>
         </w:r>
         <w:r>
           <w:rPr>
@@ -1379,7 +1487,7 @@
           <w14:ligatures w14:val="standardContextual"/>
         </w:rPr>
       </w:pPr>
-      <w:hyperlink w:anchor="_Toc210140251" w:history="1">
+      <w:hyperlink w:anchor="_Toc213681847" w:history="1">
         <w:r>
           <w:rPr>
             <w:rStyle w:val="Hyperlink"/>
@@ -1406,7 +1514,7 @@
             <w:noProof/>
             <w:webHidden/>
           </w:rPr>
-          <w:instrText xml:space="preserve"> PAGEREF _Toc210140251 \h </w:instrText>
+          <w:instrText xml:space="preserve"> PAGEREF _Toc213681847 \h </w:instrText>
         </w:r>
         <w:r>
           <w:rPr>
@@ -1537,7 +1645,7 @@
         </w:rPr>
         <w:fldChar w:fldCharType="separate"/>
       </w:r>
-      <w:hyperlink w:anchor="_Toc210140266" w:history="1">
+      <w:hyperlink w:anchor="_Toc213681853" w:history="1">
         <w:r>
           <w:rPr>
             <w:rStyle w:val="Hyperlink"/>
@@ -1564,7 +1672,7 @@
             <w:noProof/>
             <w:webHidden/>
           </w:rPr>
-          <w:instrText xml:space="preserve"> PAGEREF _Toc210140266 \h </w:instrText>
+          <w:instrText xml:space="preserve"> PAGEREF _Toc213681853 \h </w:instrText>
         </w:r>
         <w:r>
           <w:rPr>
@@ -1606,7 +1714,7 @@
           <w14:ligatures w14:val="standardContextual"/>
         </w:rPr>
       </w:pPr>
-      <w:hyperlink w:anchor="_Toc210140267" w:history="1">
+      <w:hyperlink w:anchor="_Toc213681854" w:history="1">
         <w:r>
           <w:rPr>
             <w:rStyle w:val="Hyperlink"/>
@@ -1633,7 +1741,7 @@
             <w:noProof/>
             <w:webHidden/>
           </w:rPr>
-          <w:instrText xml:space="preserve"> PAGEREF _Toc210140267 \h </w:instrText>
+          <w:instrText xml:space="preserve"> PAGEREF _Toc213681854 \h </w:instrText>
         </w:r>
         <w:r>
           <w:rPr>
@@ -1675,13 +1783,41 @@
           <w14:ligatures w14:val="standardContextual"/>
         </w:rPr>
       </w:pPr>
-      <w:hyperlink w:anchor="_Toc210140268" w:history="1">
+      <w:hyperlink w:anchor="_Toc213681855" w:history="1">
         <w:r>
           <w:rPr>
             <w:rStyle w:val="Hyperlink"/>
             <w:noProof/>
           </w:rPr>
-          <w:t>Tabela 3: cronograma atividades</w:t>
+          <w:t>Tabela 3: cronogram</w:t>
+        </w:r>
+        <w:r>
+          <w:rPr>
+            <w:rStyle w:val="Hyperlink"/>
+            <w:noProof/>
+          </w:rPr>
+          <w:t>a</w:t>
+        </w:r>
+        <w:r>
+          <w:rPr>
+            <w:rStyle w:val="Hyperlink"/>
+            <w:noProof/>
+          </w:rPr>
+          <w:t xml:space="preserve"> </w:t>
+        </w:r>
+        <w:r>
+          <w:rPr>
+            <w:rStyle w:val="Hyperlink"/>
+            <w:noProof/>
+          </w:rPr>
+          <w:t xml:space="preserve">de </w:t>
+        </w:r>
+        <w:r>
+          <w:rPr>
+            <w:rStyle w:val="Hyperlink"/>
+            <w:noProof/>
+          </w:rPr>
+          <w:t>atividades</w:t>
         </w:r>
         <w:r>
           <w:rPr>
@@ -1702,7 +1838,7 @@
             <w:noProof/>
             <w:webHidden/>
           </w:rPr>
-          <w:instrText xml:space="preserve"> PAGEREF _Toc210140268 \h </w:instrText>
+          <w:instrText xml:space="preserve"> PAGEREF _Toc213681855 \h </w:instrText>
         </w:r>
         <w:r>
           <w:rPr>
@@ -1818,88 +1954,6 @@
           <w:color w:val="FF0000"/>
         </w:rPr>
       </w:pPr>
-    </w:p>
-    <w:p>
-      <w:pPr>
-        <w:rPr>
-          <w:rFonts w:asciiTheme="majorHAnsi" w:hAnsiTheme="majorHAnsi" w:cstheme="majorHAnsi"/>
-          <w:color w:val="000000" w:themeColor="text1"/>
-          <w:lang w:val="en-US"/>
-        </w:rPr>
-      </w:pPr>
-      <w:r>
-        <w:rPr>
-          <w:rFonts w:asciiTheme="majorHAnsi" w:hAnsiTheme="majorHAnsi" w:cstheme="majorHAnsi"/>
-          <w:color w:val="000000" w:themeColor="text1"/>
-          <w:lang w:val="en-US"/>
-        </w:rPr>
-        <w:t>RCP</w:t>
-      </w:r>
-      <w:r>
-        <w:rPr>
-          <w:rFonts w:asciiTheme="majorHAnsi" w:hAnsiTheme="majorHAnsi" w:cstheme="majorHAnsi"/>
-          <w:color w:val="000000" w:themeColor="text1"/>
-          <w:lang w:val="en-US"/>
-        </w:rPr>
-        <w:tab/>
-      </w:r>
-      <w:r>
-        <w:rPr>
-          <w:rFonts w:asciiTheme="majorHAnsi" w:hAnsiTheme="majorHAnsi" w:cstheme="majorHAnsi"/>
-          <w:color w:val="000000" w:themeColor="text1"/>
-          <w:lang w:val="en-US"/>
-        </w:rPr>
-        <w:t xml:space="preserve">               </w:t>
-      </w:r>
-      <w:r>
-        <w:rPr>
-          <w:rFonts w:asciiTheme="majorHAnsi" w:hAnsiTheme="majorHAnsi" w:cstheme="majorHAnsi"/>
-          <w:color w:val="000000" w:themeColor="text1"/>
-          <w:lang w:val="en-US"/>
-        </w:rPr>
-        <w:t>Rapid Control Prototyping</w:t>
-      </w:r>
-    </w:p>
-    <w:p>
-      <w:pPr>
-        <w:rPr>
-          <w:rFonts w:asciiTheme="majorHAnsi" w:hAnsiTheme="majorHAnsi" w:cstheme="majorHAnsi"/>
-          <w:color w:val="000000" w:themeColor="text1"/>
-          <w:lang w:val="en-US"/>
-        </w:rPr>
-      </w:pPr>
-      <w:r>
-        <w:rPr>
-          <w:rFonts w:asciiTheme="majorHAnsi" w:hAnsiTheme="majorHAnsi" w:cstheme="majorHAnsi"/>
-          <w:color w:val="000000" w:themeColor="text1"/>
-          <w:lang w:val="en-US"/>
-        </w:rPr>
-        <w:t>NCS</w:t>
-      </w:r>
-      <w:r>
-        <w:rPr>
-          <w:rFonts w:asciiTheme="majorHAnsi" w:hAnsiTheme="majorHAnsi" w:cstheme="majorHAnsi"/>
-          <w:color w:val="000000" w:themeColor="text1"/>
-          <w:lang w:val="en-US"/>
-        </w:rPr>
-        <w:tab/>
-      </w:r>
-      <w:r>
-        <w:rPr>
-          <w:rFonts w:asciiTheme="majorHAnsi" w:hAnsiTheme="majorHAnsi" w:cstheme="majorHAnsi"/>
-          <w:color w:val="000000" w:themeColor="text1"/>
-          <w:lang w:val="en-US"/>
-        </w:rPr>
-        <w:t xml:space="preserve">               </w:t>
-      </w:r>
-      <w:r>
-        <w:rPr>
-          <w:rFonts w:asciiTheme="majorHAnsi" w:hAnsiTheme="majorHAnsi" w:cstheme="majorHAnsi"/>
-          <w:color w:val="000000" w:themeColor="text1"/>
-          <w:lang w:val="en-US"/>
-        </w:rPr>
-        <w:t>Networked Control Systems</w:t>
-      </w:r>
     </w:p>
     <w:p>
       <w:pPr>
@@ -2296,7 +2350,7 @@
             </w:rPr>
             <w:fldChar w:fldCharType="separate"/>
           </w:r>
-          <w:hyperlink w:anchor="_Toc210140277" w:history="1">
+          <w:hyperlink w:anchor="_Toc213681884" w:history="1">
             <w:r>
               <w:rPr>
                 <w:rStyle w:val="Hyperlink"/>
@@ -2341,7 +2395,7 @@
                 <w:noProof/>
                 <w:webHidden/>
               </w:rPr>
-              <w:instrText xml:space="preserve"> PAGEREF _Toc210140277 \h </w:instrText>
+              <w:instrText xml:space="preserve"> PAGEREF _Toc213681884 \h </w:instrText>
             </w:r>
             <w:r>
               <w:rPr>
@@ -2389,7 +2443,7 @@
               <w14:ligatures w14:val="standardContextual"/>
             </w:rPr>
           </w:pPr>
-          <w:hyperlink w:anchor="_Toc210140278" w:history="1">
+          <w:hyperlink w:anchor="_Toc213681885" w:history="1">
             <w:r>
               <w:rPr>
                 <w:rStyle w:val="Hyperlink"/>
@@ -2436,7 +2490,7 @@
                 <w:noProof/>
                 <w:webHidden/>
               </w:rPr>
-              <w:instrText xml:space="preserve"> PAGEREF _Toc210140278 \h </w:instrText>
+              <w:instrText xml:space="preserve"> PAGEREF _Toc213681885 \h </w:instrText>
             </w:r>
             <w:r>
               <w:rPr>
@@ -2484,7 +2538,7 @@
               <w14:ligatures w14:val="standardContextual"/>
             </w:rPr>
           </w:pPr>
-          <w:hyperlink w:anchor="_Toc210140279" w:history="1">
+          <w:hyperlink w:anchor="_Toc213681886" w:history="1">
             <w:r>
               <w:rPr>
                 <w:rStyle w:val="Hyperlink"/>
@@ -2531,7 +2585,7 @@
                 <w:noProof/>
                 <w:webHidden/>
               </w:rPr>
-              <w:instrText xml:space="preserve"> PAGEREF _Toc210140279 \h </w:instrText>
+              <w:instrText xml:space="preserve"> PAGEREF _Toc213681886 \h </w:instrText>
             </w:r>
             <w:r>
               <w:rPr>
@@ -2574,7 +2628,7 @@
               <w14:ligatures w14:val="standardContextual"/>
             </w:rPr>
           </w:pPr>
-          <w:hyperlink w:anchor="_Toc210140280" w:history="1">
+          <w:hyperlink w:anchor="_Toc213681887" w:history="1">
             <w:r>
               <w:rPr>
                 <w:rStyle w:val="Hyperlink"/>
@@ -2619,7 +2673,7 @@
                 <w:noProof/>
                 <w:webHidden/>
               </w:rPr>
-              <w:instrText xml:space="preserve"> PAGEREF _Toc210140280 \h </w:instrText>
+              <w:instrText xml:space="preserve"> PAGEREF _Toc213681887 \h </w:instrText>
             </w:r>
             <w:r>
               <w:rPr>
@@ -2667,7 +2721,7 @@
               <w14:ligatures w14:val="standardContextual"/>
             </w:rPr>
           </w:pPr>
-          <w:hyperlink w:anchor="_Toc210140281" w:history="1">
+          <w:hyperlink w:anchor="_Toc213681888" w:history="1">
             <w:r>
               <w:rPr>
                 <w:rStyle w:val="Hyperlink"/>
@@ -2714,7 +2768,7 @@
                 <w:noProof/>
                 <w:webHidden/>
               </w:rPr>
-              <w:instrText xml:space="preserve"> PAGEREF _Toc210140281 \h </w:instrText>
+              <w:instrText xml:space="preserve"> PAGEREF _Toc213681888 \h </w:instrText>
             </w:r>
             <w:r>
               <w:rPr>
@@ -2762,7 +2816,7 @@
               <w14:ligatures w14:val="standardContextual"/>
             </w:rPr>
           </w:pPr>
-          <w:hyperlink w:anchor="_Toc210140282" w:history="1">
+          <w:hyperlink w:anchor="_Toc213681889" w:history="1">
             <w:r>
               <w:rPr>
                 <w:rStyle w:val="Hyperlink"/>
@@ -2809,7 +2863,7 @@
                 <w:noProof/>
                 <w:webHidden/>
               </w:rPr>
-              <w:instrText xml:space="preserve"> PAGEREF _Toc210140282 \h </w:instrText>
+              <w:instrText xml:space="preserve"> PAGEREF _Toc213681889 \h </w:instrText>
             </w:r>
             <w:r>
               <w:rPr>
@@ -2857,7 +2911,7 @@
               <w14:ligatures w14:val="standardContextual"/>
             </w:rPr>
           </w:pPr>
-          <w:hyperlink w:anchor="_Toc210140283" w:history="1">
+          <w:hyperlink w:anchor="_Toc213681890" w:history="1">
             <w:r>
               <w:rPr>
                 <w:rStyle w:val="Hyperlink"/>
@@ -2904,7 +2958,7 @@
                 <w:noProof/>
                 <w:webHidden/>
               </w:rPr>
-              <w:instrText xml:space="preserve"> PAGEREF _Toc210140283 \h </w:instrText>
+              <w:instrText xml:space="preserve"> PAGEREF _Toc213681890 \h </w:instrText>
             </w:r>
             <w:r>
               <w:rPr>
@@ -2952,7 +3006,7 @@
               <w14:ligatures w14:val="standardContextual"/>
             </w:rPr>
           </w:pPr>
-          <w:hyperlink w:anchor="_Toc210140284" w:history="1">
+          <w:hyperlink w:anchor="_Toc213681891" w:history="1">
             <w:r>
               <w:rPr>
                 <w:rStyle w:val="Hyperlink"/>
@@ -2999,7 +3053,7 @@
                 <w:noProof/>
                 <w:webHidden/>
               </w:rPr>
-              <w:instrText xml:space="preserve"> PAGEREF _Toc210140284 \h </w:instrText>
+              <w:instrText xml:space="preserve"> PAGEREF _Toc213681891 \h </w:instrText>
             </w:r>
             <w:r>
               <w:rPr>
@@ -3046,7 +3100,7 @@
               <w14:ligatures w14:val="standardContextual"/>
             </w:rPr>
           </w:pPr>
-          <w:hyperlink w:anchor="_Toc210140285" w:history="1">
+          <w:hyperlink w:anchor="_Toc213681892" w:history="1">
             <w:r>
               <w:rPr>
                 <w:rStyle w:val="Hyperlink"/>
@@ -3092,7 +3146,7 @@
                 <w:noProof/>
                 <w:webHidden/>
               </w:rPr>
-              <w:instrText xml:space="preserve"> PAGEREF _Toc210140285 \h </w:instrText>
+              <w:instrText xml:space="preserve"> PAGEREF _Toc213681892 \h </w:instrText>
             </w:r>
             <w:r>
               <w:rPr>
@@ -3139,7 +3193,7 @@
               <w14:ligatures w14:val="standardContextual"/>
             </w:rPr>
           </w:pPr>
-          <w:hyperlink w:anchor="_Toc210140286" w:history="1">
+          <w:hyperlink w:anchor="_Toc213681893" w:history="1">
             <w:r>
               <w:rPr>
                 <w:rStyle w:val="Hyperlink"/>
@@ -3185,7 +3239,7 @@
                 <w:noProof/>
                 <w:webHidden/>
               </w:rPr>
-              <w:instrText xml:space="preserve"> PAGEREF _Toc210140286 \h </w:instrText>
+              <w:instrText xml:space="preserve"> PAGEREF _Toc213681893 \h </w:instrText>
             </w:r>
             <w:r>
               <w:rPr>
@@ -3232,7 +3286,7 @@
               <w14:ligatures w14:val="standardContextual"/>
             </w:rPr>
           </w:pPr>
-          <w:hyperlink w:anchor="_Toc210140287" w:history="1">
+          <w:hyperlink w:anchor="_Toc213681894" w:history="1">
             <w:r>
               <w:rPr>
                 <w:rStyle w:val="Hyperlink"/>
@@ -3278,7 +3332,7 @@
                 <w:noProof/>
                 <w:webHidden/>
               </w:rPr>
-              <w:instrText xml:space="preserve"> PAGEREF _Toc210140287 \h </w:instrText>
+              <w:instrText xml:space="preserve"> PAGEREF _Toc213681894 \h </w:instrText>
             </w:r>
             <w:r>
               <w:rPr>
@@ -3326,7 +3380,7 @@
               <w14:ligatures w14:val="standardContextual"/>
             </w:rPr>
           </w:pPr>
-          <w:hyperlink w:anchor="_Toc210140288" w:history="1">
+          <w:hyperlink w:anchor="_Toc213681895" w:history="1">
             <w:r>
               <w:rPr>
                 <w:rStyle w:val="Hyperlink"/>
@@ -3373,7 +3427,7 @@
                 <w:noProof/>
                 <w:webHidden/>
               </w:rPr>
-              <w:instrText xml:space="preserve"> PAGEREF _Toc210140288 \h </w:instrText>
+              <w:instrText xml:space="preserve"> PAGEREF _Toc213681895 \h </w:instrText>
             </w:r>
             <w:r>
               <w:rPr>
@@ -3420,7 +3474,7 @@
               <w14:ligatures w14:val="standardContextual"/>
             </w:rPr>
           </w:pPr>
-          <w:hyperlink w:anchor="_Toc210140289" w:history="1">
+          <w:hyperlink w:anchor="_Toc213681896" w:history="1">
             <w:r>
               <w:rPr>
                 <w:rStyle w:val="Hyperlink"/>
@@ -3466,7 +3520,7 @@
                 <w:noProof/>
                 <w:webHidden/>
               </w:rPr>
-              <w:instrText xml:space="preserve"> PAGEREF _Toc210140289 \h </w:instrText>
+              <w:instrText xml:space="preserve"> PAGEREF _Toc213681896 \h </w:instrText>
             </w:r>
             <w:r>
               <w:rPr>
@@ -3514,7 +3568,7 @@
               <w14:ligatures w14:val="standardContextual"/>
             </w:rPr>
           </w:pPr>
-          <w:hyperlink w:anchor="_Toc210140290" w:history="1">
+          <w:hyperlink w:anchor="_Toc213681897" w:history="1">
             <w:r>
               <w:rPr>
                 <w:rStyle w:val="Hyperlink"/>
@@ -3561,7 +3615,7 @@
                 <w:noProof/>
                 <w:webHidden/>
               </w:rPr>
-              <w:instrText xml:space="preserve"> PAGEREF _Toc210140290 \h </w:instrText>
+              <w:instrText xml:space="preserve"> PAGEREF _Toc213681897 \h </w:instrText>
             </w:r>
             <w:r>
               <w:rPr>
@@ -3608,7 +3662,7 @@
               <w14:ligatures w14:val="standardContextual"/>
             </w:rPr>
           </w:pPr>
-          <w:hyperlink w:anchor="_Toc210140291" w:history="1">
+          <w:hyperlink w:anchor="_Toc213681898" w:history="1">
             <w:r>
               <w:rPr>
                 <w:rStyle w:val="Hyperlink"/>
@@ -3654,7 +3708,7 @@
                 <w:noProof/>
                 <w:webHidden/>
               </w:rPr>
-              <w:instrText xml:space="preserve"> PAGEREF _Toc210140291 \h </w:instrText>
+              <w:instrText xml:space="preserve"> PAGEREF _Toc213681898 \h </w:instrText>
             </w:r>
             <w:r>
               <w:rPr>
@@ -3697,7 +3751,7 @@
               <w14:ligatures w14:val="standardContextual"/>
             </w:rPr>
           </w:pPr>
-          <w:hyperlink w:anchor="_Toc210140292" w:history="1">
+          <w:hyperlink w:anchor="_Toc213681899" w:history="1">
             <w:r>
               <w:rPr>
                 <w:rStyle w:val="Hyperlink"/>
@@ -3742,7 +3796,7 @@
                 <w:noProof/>
                 <w:webHidden/>
               </w:rPr>
-              <w:instrText xml:space="preserve"> PAGEREF _Toc210140292 \h </w:instrText>
+              <w:instrText xml:space="preserve"> PAGEREF _Toc213681899 \h </w:instrText>
             </w:r>
             <w:r>
               <w:rPr>
@@ -3790,7 +3844,7 @@
               <w14:ligatures w14:val="standardContextual"/>
             </w:rPr>
           </w:pPr>
-          <w:hyperlink w:anchor="_Toc210140293" w:history="1">
+          <w:hyperlink w:anchor="_Toc213681900" w:history="1">
             <w:r>
               <w:rPr>
                 <w:rStyle w:val="Hyperlink"/>
@@ -3837,7 +3891,7 @@
                 <w:noProof/>
                 <w:webHidden/>
               </w:rPr>
-              <w:instrText xml:space="preserve"> PAGEREF _Toc210140293 \h </w:instrText>
+              <w:instrText xml:space="preserve"> PAGEREF _Toc213681900 \h </w:instrText>
             </w:r>
             <w:r>
               <w:rPr>
@@ -3885,7 +3939,7 @@
               <w14:ligatures w14:val="standardContextual"/>
             </w:rPr>
           </w:pPr>
-          <w:hyperlink w:anchor="_Toc210140294" w:history="1">
+          <w:hyperlink w:anchor="_Toc213681901" w:history="1">
             <w:r>
               <w:rPr>
                 <w:rStyle w:val="Hyperlink"/>
@@ -3932,7 +3986,7 @@
                 <w:noProof/>
                 <w:webHidden/>
               </w:rPr>
-              <w:instrText xml:space="preserve"> PAGEREF _Toc210140294 \h </w:instrText>
+              <w:instrText xml:space="preserve"> PAGEREF _Toc213681901 \h </w:instrText>
             </w:r>
             <w:r>
               <w:rPr>
@@ -3975,7 +4029,7 @@
               <w14:ligatures w14:val="standardContextual"/>
             </w:rPr>
           </w:pPr>
-          <w:hyperlink w:anchor="_Toc210140295" w:history="1">
+          <w:hyperlink w:anchor="_Toc213681902" w:history="1">
             <w:r>
               <w:rPr>
                 <w:rStyle w:val="Hyperlink"/>
@@ -4020,7 +4074,7 @@
                 <w:noProof/>
                 <w:webHidden/>
               </w:rPr>
-              <w:instrText xml:space="preserve"> PAGEREF _Toc210140295 \h </w:instrText>
+              <w:instrText xml:space="preserve"> PAGEREF _Toc213681902 \h </w:instrText>
             </w:r>
             <w:r>
               <w:rPr>
@@ -4063,7 +4117,7 @@
               <w14:ligatures w14:val="standardContextual"/>
             </w:rPr>
           </w:pPr>
-          <w:hyperlink w:anchor="_Toc210140296" w:history="1">
+          <w:hyperlink w:anchor="_Toc213681903" w:history="1">
             <w:r>
               <w:rPr>
                 <w:rStyle w:val="Hyperlink"/>
@@ -4108,7 +4162,7 @@
                 <w:noProof/>
                 <w:webHidden/>
               </w:rPr>
-              <w:instrText xml:space="preserve"> PAGEREF _Toc210140296 \h </w:instrText>
+              <w:instrText xml:space="preserve"> PAGEREF _Toc213681903 \h </w:instrText>
             </w:r>
             <w:r>
               <w:rPr>
@@ -4153,7 +4207,7 @@
               <w14:ligatures w14:val="standardContextual"/>
             </w:rPr>
           </w:pPr>
-          <w:hyperlink w:anchor="_Toc210140297" w:history="1">
+          <w:hyperlink w:anchor="_Toc213681904" w:history="1">
             <w:r>
               <w:rPr>
                 <w:rStyle w:val="Hyperlink"/>
@@ -4181,7 +4235,7 @@
                 <w:noProof/>
                 <w:webHidden/>
               </w:rPr>
-              <w:instrText xml:space="preserve"> PAGEREF _Toc210140297 \h </w:instrText>
+              <w:instrText xml:space="preserve"> PAGEREF _Toc213681904 \h </w:instrText>
             </w:r>
             <w:r>
               <w:rPr>
@@ -4235,13 +4289,13 @@
         </w:p>
       </w:sdtContent>
     </w:sdt>
+    <w:bookmarkStart w:id="1" w:name="_Toc175231779"/>
+    <w:bookmarkStart w:id="2" w:name="_Toc175908722"/>
+    <w:bookmarkStart w:id="3" w:name="_Toc213681884"/>
     <w:p>
       <w:pPr>
         <w:pStyle w:val="Ttulo1"/>
       </w:pPr>
-      <w:bookmarkStart w:id="1" w:name="_Toc175231779"/>
-      <w:bookmarkStart w:id="2" w:name="_Toc175908722"/>
-      <w:bookmarkStart w:id="3" w:name="_Toc210140277"/>
       <w:r>
         <w:rPr>
           <w:noProof/>
@@ -4828,7 +4882,7 @@
       <w:bookmarkStart w:id="12" w:name="_Toc175218595"/>
       <w:bookmarkStart w:id="13" w:name="_Toc175231785"/>
       <w:bookmarkStart w:id="14" w:name="_Toc175908723"/>
-      <w:bookmarkStart w:id="15" w:name="_Toc210140278"/>
+      <w:bookmarkStart w:id="15" w:name="_Toc213681885"/>
       <w:r>
         <w:t>justificativa</w:t>
       </w:r>
@@ -5151,7 +5205,7 @@
       <w:bookmarkStart w:id="16" w:name="_Toc175218596"/>
       <w:bookmarkStart w:id="17" w:name="_Toc175231786"/>
       <w:bookmarkStart w:id="18" w:name="_Toc175908724"/>
-      <w:bookmarkStart w:id="19" w:name="_Toc210140279"/>
+      <w:bookmarkStart w:id="19" w:name="_Toc213681886"/>
       <w:r>
         <w:t>OBJETIVOS</w:t>
       </w:r>
@@ -5513,7 +5567,7 @@
       <w:bookmarkStart w:id="20" w:name="_Toc175218597"/>
       <w:bookmarkStart w:id="21" w:name="_Toc175231787"/>
       <w:bookmarkStart w:id="22" w:name="_Toc175908725"/>
-      <w:bookmarkStart w:id="23" w:name="_Toc210140280"/>
+      <w:bookmarkStart w:id="23" w:name="_Toc213681887"/>
       <w:r>
         <w:lastRenderedPageBreak/>
         <w:t>REFERENCIAL TEÓRICO</w:t>
@@ -5541,7 +5595,7 @@
       <w:pPr>
         <w:pStyle w:val="Ttulo2"/>
       </w:pPr>
-      <w:bookmarkStart w:id="37" w:name="_Toc210140281"/>
+      <w:bookmarkStart w:id="37" w:name="_Toc213681888"/>
       <w:r>
         <w:t>Design Thinking</w:t>
       </w:r>
@@ -6041,7 +6095,7 @@
       <w:pPr>
         <w:pStyle w:val="Ttulo2"/>
       </w:pPr>
-      <w:bookmarkStart w:id="38" w:name="_Toc210140282"/>
+      <w:bookmarkStart w:id="38" w:name="_Toc213681889"/>
       <w:r>
         <w:t>Design UI UX</w:t>
       </w:r>
@@ -6237,7 +6291,7 @@
       <w:pPr>
         <w:pStyle w:val="Ttulo2"/>
       </w:pPr>
-      <w:bookmarkStart w:id="39" w:name="_Toc210140283"/>
+      <w:bookmarkStart w:id="39" w:name="_Toc213681890"/>
       <w:r>
         <w:t xml:space="preserve">processo de software e o </w:t>
       </w:r>
@@ -6390,6 +6444,7 @@
       <w:r>
         <w:t xml:space="preserve"> (</w:t>
       </w:r>
+      <w:proofErr w:type="spellStart"/>
       <w:r>
         <w:rPr>
           <w:b/>
@@ -6397,7 +6452,17 @@
           <w:i/>
           <w:iCs/>
         </w:rPr>
-        <w:t>Waterfall Modell</w:t>
+        <w:t>Waterfall</w:t>
+      </w:r>
+      <w:proofErr w:type="spellEnd"/>
+      <w:r>
+        <w:rPr>
+          <w:b/>
+          <w:bCs/>
+          <w:i/>
+          <w:iCs/>
+        </w:rPr>
+        <w:t xml:space="preserve"> Model</w:t>
       </w:r>
       <w:r>
         <w:t>)</w:t>
@@ -6486,7 +6551,25 @@
             <w:rPr>
               <w:noProof/>
             </w:rPr>
-            <w:t>SOMMERVILLE, 2011</w:t>
+            <w:t xml:space="preserve"> (</w:t>
+          </w:r>
+          <w:hyperlink w:anchor="Som16" w:history="1">
+            <w:r>
+              <w:rPr>
+                <w:rStyle w:val="Ttulo2Char"/>
+                <w:rFonts w:eastAsia="Calibri"/>
+                <w:noProof/>
+                <w:sz w:val="24"/>
+                <w:szCs w:val="24"/>
+              </w:rPr>
+              <w:t>Sommerville, 2011</w:t>
+            </w:r>
+          </w:hyperlink>
+          <w:r>
+            <w:rPr>
+              <w:noProof/>
+            </w:rPr>
+            <w:t>)</w:t>
           </w:r>
           <w:r>
             <w:fldChar w:fldCharType="end"/>
@@ -6699,7 +6782,7 @@
         <w:pStyle w:val="Ttulo2"/>
       </w:pPr>
       <w:bookmarkStart w:id="40" w:name="_jd3d4s30kzvs" w:colFirst="0" w:colLast="0"/>
-      <w:bookmarkStart w:id="41" w:name="_Toc210140284"/>
+      <w:bookmarkStart w:id="41" w:name="_Toc213681891"/>
       <w:bookmarkEnd w:id="40"/>
       <w:r>
         <w:lastRenderedPageBreak/>
@@ -6905,10 +6988,87 @@
         <w:t>Na prática, a ER é um processo iterativo em que as atividades são intercaladas</w:t>
       </w:r>
       <w:r>
-        <w:t xml:space="preserve"> (Sommerville, 2011)</w:t>
-      </w:r>
-      <w:r>
-        <w:t>. As</w:t>
+        <w:t xml:space="preserve"> </w:t>
+      </w:r>
+      <w:sdt>
+        <w:sdtPr>
+          <w:rPr>
+            <w:b/>
+            <w:bCs/>
+          </w:rPr>
+          <w:id w:val="-608346553"/>
+          <w:citation/>
+        </w:sdtPr>
+        <w:sdtContent>
+          <w:r>
+            <w:rPr>
+              <w:b/>
+              <w:bCs/>
+            </w:rPr>
+            <w:fldChar w:fldCharType="begin"/>
+          </w:r>
+          <w:r>
+            <w:rPr>
+              <w:b/>
+              <w:bCs/>
+            </w:rPr>
+            <w:instrText xml:space="preserve"> CITATION Som16 \l 1046 </w:instrText>
+          </w:r>
+          <w:r>
+            <w:rPr>
+              <w:b/>
+              <w:bCs/>
+            </w:rPr>
+            <w:fldChar w:fldCharType="separate"/>
+          </w:r>
+          <w:r>
+            <w:rPr>
+              <w:b/>
+              <w:bCs/>
+              <w:noProof/>
+            </w:rPr>
+            <w:t>(</w:t>
+          </w:r>
+          <w:hyperlink w:anchor="Som16" w:history="1">
+            <w:r>
+              <w:rPr>
+                <w:rStyle w:val="Ttulo2Char"/>
+                <w:rFonts w:eastAsia="Calibri"/>
+                <w:b w:val="0"/>
+                <w:bCs/>
+                <w:noProof/>
+                <w:sz w:val="24"/>
+                <w:szCs w:val="24"/>
+              </w:rPr>
+              <w:t>Sommerville, 2011</w:t>
+            </w:r>
+          </w:hyperlink>
+          <w:r>
+            <w:rPr>
+              <w:b/>
+              <w:bCs/>
+              <w:noProof/>
+            </w:rPr>
+            <w:t>)</w:t>
+          </w:r>
+          <w:r>
+            <w:rPr>
+              <w:b/>
+              <w:bCs/>
+            </w:rPr>
+            <w:fldChar w:fldCharType="end"/>
+          </w:r>
+        </w:sdtContent>
+      </w:sdt>
+      <w:r>
+        <w:rPr>
+          <w:b/>
+          <w:bCs/>
+        </w:rPr>
+        <w:t>.</w:t>
+      </w:r>
+      <w:r>
+        <w:t xml:space="preserve"> As</w:t>
       </w:r>
       <w:r>
         <w:t>sim, as</w:t>
@@ -7082,7 +7242,7 @@
         <w:pStyle w:val="Legenda"/>
         <w:keepNext/>
       </w:pPr>
-      <w:bookmarkStart w:id="42" w:name="_Toc210140249"/>
+      <w:bookmarkStart w:id="42" w:name="_Toc213681845"/>
       <w:r>
         <w:lastRenderedPageBreak/>
         <w:t xml:space="preserve">Figura </w:t>
@@ -7357,7 +7517,7 @@
         <w:pStyle w:val="Ttulo3"/>
       </w:pPr>
       <w:bookmarkStart w:id="43" w:name="_q8idu7nt7lr7" w:colFirst="0" w:colLast="0"/>
-      <w:bookmarkStart w:id="44" w:name="_Toc210140285"/>
+      <w:bookmarkStart w:id="44" w:name="_Toc213681892"/>
       <w:bookmarkEnd w:id="43"/>
       <w:r>
         <w:lastRenderedPageBreak/>
@@ -7443,7 +7603,7 @@
         <w:pStyle w:val="Legenda"/>
         <w:keepNext/>
       </w:pPr>
-      <w:bookmarkStart w:id="45" w:name="_Toc210140250"/>
+      <w:bookmarkStart w:id="45" w:name="_Toc213681846"/>
       <w:r>
         <w:t xml:space="preserve">Figura </w:t>
       </w:r>
@@ -7528,6 +7688,13 @@
     <w:p>
       <w:r>
         <w:tab/>
+      </w:r>
+    </w:p>
+    <w:p>
+      <w:r>
+        <w:tab/>
+      </w:r>
+      <w:r>
         <w:t>Segundo Martins (2010) a elicitação e especificação de requisitos são etapas essenciais no processo de desenvolvimento de software influenciando e garantido diretamente atender as necessidades dos usuários. A elicitação tem como objetivo central entender as necessidades e desejos dos stakeholders por meio de técnicas como entrevistas, questionários, observações e análise documental.  A especificação é a base para garantir que o software seja desenvolvido de maneira alinhada às necessidades concretas dos usuários, reduzindo falhas e retrabalhos ao longo do projeto.</w:t>
       </w:r>
     </w:p>
@@ -7543,7 +7710,7 @@
       </w:pPr>
       <w:bookmarkStart w:id="46" w:name="_w69741rzzqa7" w:colFirst="0" w:colLast="0"/>
       <w:bookmarkStart w:id="47" w:name="_iy6ohgihhx" w:colFirst="0" w:colLast="0"/>
-      <w:bookmarkStart w:id="48" w:name="_Toc210140286"/>
+      <w:bookmarkStart w:id="48" w:name="_Toc213681893"/>
       <w:bookmarkEnd w:id="46"/>
       <w:bookmarkEnd w:id="47"/>
       <w:r>
@@ -7633,7 +7800,7 @@
       <w:pPr>
         <w:pStyle w:val="Ttulo3"/>
       </w:pPr>
-      <w:bookmarkStart w:id="49" w:name="_Toc210140287"/>
+      <w:bookmarkStart w:id="49" w:name="_Toc213681894"/>
       <w:r>
         <w:t>Requisitos não funcionais</w:t>
       </w:r>
@@ -7676,7 +7843,7 @@
         <w:pStyle w:val="Ttulo2"/>
       </w:pPr>
       <w:bookmarkStart w:id="50" w:name="_eyfomf1iew8y" w:colFirst="0" w:colLast="0"/>
-      <w:bookmarkStart w:id="51" w:name="_Toc210140288"/>
+      <w:bookmarkStart w:id="51" w:name="_Toc213681895"/>
       <w:bookmarkEnd w:id="50"/>
       <w:r>
         <w:t>casos de uso</w:t>
@@ -7686,8 +7853,6 @@
     <w:p>
       <w:bookmarkStart w:id="52" w:name="_mf3ts4xzg9qo" w:colFirst="0" w:colLast="0"/>
       <w:bookmarkEnd w:id="52"/>
-    </w:p>
-    <w:p>
       <w:r>
         <w:t xml:space="preserve">Os casos de uso foram desenvolvidos originalmente para auxiliar na elicitação de requisitos. É uma técnica muito utilizada </w:t>
       </w:r>
@@ -7741,7 +7906,7 @@
         <w:pStyle w:val="Ttulo3"/>
       </w:pPr>
       <w:bookmarkStart w:id="53" w:name="_f8tv7r97tdhh" w:colFirst="0" w:colLast="0"/>
-      <w:bookmarkStart w:id="54" w:name="_Toc210140289"/>
+      <w:bookmarkStart w:id="54" w:name="_Toc213681896"/>
       <w:bookmarkEnd w:id="53"/>
       <w:r>
         <w:t>Diagramas de casos de uso</w:t>
@@ -7879,7 +8044,7 @@
         <w:pStyle w:val="Legenda"/>
         <w:keepNext/>
       </w:pPr>
-      <w:bookmarkStart w:id="55" w:name="_Toc210140251"/>
+      <w:bookmarkStart w:id="55" w:name="_Toc213681847"/>
       <w:r>
         <w:t xml:space="preserve">Figura </w:t>
       </w:r>
@@ -8069,7 +8234,7 @@
         <w:pStyle w:val="Legenda"/>
         <w:keepNext/>
       </w:pPr>
-      <w:bookmarkStart w:id="56" w:name="_Toc210140266"/>
+      <w:bookmarkStart w:id="56" w:name="_Toc213681853"/>
       <w:r>
         <w:t xml:space="preserve">Tabela </w:t>
       </w:r>
@@ -8152,7 +8317,7 @@
         <w:pStyle w:val="Ttulo2"/>
       </w:pPr>
       <w:bookmarkStart w:id="57" w:name="_1lsl0myurey5" w:colFirst="0" w:colLast="0"/>
-      <w:bookmarkStart w:id="58" w:name="_Toc210140290"/>
+      <w:bookmarkStart w:id="58" w:name="_Toc213681897"/>
       <w:bookmarkEnd w:id="57"/>
       <w:r>
         <w:lastRenderedPageBreak/>
@@ -8209,7 +8374,7 @@
       <w:pPr>
         <w:pStyle w:val="Ttulo3"/>
       </w:pPr>
-      <w:bookmarkStart w:id="59" w:name="_Toc210140291"/>
+      <w:bookmarkStart w:id="59" w:name="_Toc213681898"/>
       <w:r>
         <w:t>Tipos de estágio</w:t>
       </w:r>
@@ -8433,7 +8598,7 @@
       <w:pPr>
         <w:pStyle w:val="Ttulo1"/>
       </w:pPr>
-      <w:bookmarkStart w:id="64" w:name="_Toc210140292"/>
+      <w:bookmarkStart w:id="64" w:name="_Toc213681899"/>
       <w:r>
         <w:lastRenderedPageBreak/>
         <w:t>METODOLOGIA</w:t>
@@ -8555,7 +8720,7 @@
       <w:pPr>
         <w:pStyle w:val="Ttulo2"/>
       </w:pPr>
-      <w:bookmarkStart w:id="65" w:name="_Toc210140293"/>
+      <w:bookmarkStart w:id="65" w:name="_Toc213681900"/>
       <w:r>
         <w:t>FASES E DISCIPLINAS do PU</w:t>
       </w:r>
@@ -8616,6 +8781,9 @@
       </w:r>
     </w:p>
     <w:p>
+      <w:pPr>
+        <w:jc w:val="center"/>
+      </w:pPr>
       <w:r>
         <w:rPr>
           <w:noProof/>
@@ -8778,7 +8946,37 @@
               <w:sz w:val="16"/>
               <w:szCs w:val="16"/>
             </w:rPr>
-            <w:t xml:space="preserve"> DENNIS; WIXOM; TEGARDEN, 2015</w:t>
+            <w:t xml:space="preserve"> </w:t>
+          </w:r>
+          <w:r>
+            <w:rPr>
+              <w:rFonts w:ascii="Times New Roman" w:hAnsi="Times New Roman" w:cs="Times New Roman"/>
+              <w:noProof/>
+              <w:sz w:val="16"/>
+              <w:szCs w:val="16"/>
+            </w:rPr>
+            <w:t>(</w:t>
+          </w:r>
+          <w:hyperlink w:anchor="Den15" w:history="1">
+            <w:r>
+              <w:rPr>
+                <w:rStyle w:val="Ttulo2Char"/>
+                <w:rFonts w:ascii="Times New Roman" w:eastAsia="Calibri" w:hAnsi="Times New Roman" w:cs="Times New Roman"/>
+                <w:noProof/>
+                <w:sz w:val="16"/>
+                <w:szCs w:val="16"/>
+              </w:rPr>
+              <w:t>Dennis, Wixom e Tegarden, 2015</w:t>
+            </w:r>
+          </w:hyperlink>
+          <w:r>
+            <w:rPr>
+              <w:rFonts w:ascii="Times New Roman" w:hAnsi="Times New Roman" w:cs="Times New Roman"/>
+              <w:noProof/>
+              <w:sz w:val="16"/>
+              <w:szCs w:val="16"/>
+            </w:rPr>
+            <w:t>)</w:t>
           </w:r>
           <w:r>
             <w:rPr>
@@ -8817,10 +9015,45 @@
         <w:t xml:space="preserve"> do PU</w:t>
       </w:r>
     </w:p>
-    <w:p/>
     <w:p>
       <w:r>
         <w:tab/>
+      </w:r>
+      <w:r>
+        <w:t xml:space="preserve">Como </w:t>
+      </w:r>
+      <w:r>
+        <w:t>todo</w:t>
+      </w:r>
+      <w:r>
+        <w:t xml:space="preserve"> </w:t>
+      </w:r>
+      <w:r>
+        <w:rPr>
+          <w:i/>
+          <w:iCs/>
+        </w:rPr>
+        <w:t>framework</w:t>
+      </w:r>
+      <w:r>
+        <w:rPr>
+          <w:i/>
+          <w:iCs/>
+        </w:rPr>
+        <w:t>,</w:t>
+      </w:r>
+      <w:r>
+        <w:rPr>
+          <w:i/>
+          <w:iCs/>
+        </w:rPr>
+        <w:t xml:space="preserve"> </w:t>
+      </w:r>
+      <w:r>
+        <w:t>PU deve ser configurado de acordo com o projeto e equipe de desenvolvimento</w:t>
+      </w:r>
+      <w:r>
+        <w:t xml:space="preserve">. </w:t>
       </w:r>
       <w:r>
         <w:t>A</w:t>
@@ -8857,56 +9090,16 @@
         <w:t>elaboração, construção e transição</w:t>
       </w:r>
       <w:r>
-        <w:t xml:space="preserve">. </w:t>
-      </w:r>
-      <w:r>
-        <w:t xml:space="preserve">Como um </w:t>
-      </w:r>
-      <w:r>
-        <w:rPr>
-          <w:i/>
-          <w:iCs/>
-        </w:rPr>
-        <w:t>framework</w:t>
-      </w:r>
-      <w:r>
-        <w:rPr>
-          <w:i/>
-          <w:iCs/>
-        </w:rPr>
-        <w:t>,</w:t>
-      </w:r>
-      <w:r>
-        <w:rPr>
-          <w:i/>
-          <w:iCs/>
-        </w:rPr>
+        <w:t>.</w:t>
+      </w:r>
+      <w:r>
         <w:t xml:space="preserve"> </w:t>
       </w:r>
-      <w:r>
-        <w:t xml:space="preserve">PU </w:t>
-      </w:r>
-      <w:r>
-        <w:t>deve ser</w:t>
-      </w:r>
-      <w:r>
-        <w:t xml:space="preserve"> configur</w:t>
-      </w:r>
-      <w:r>
-        <w:t>ado</w:t>
-      </w:r>
-      <w:r>
-        <w:t xml:space="preserve"> de acordo com o projeto e equipe de </w:t>
-      </w:r>
+    </w:p>
+    <w:p>
       <w:r>
         <w:lastRenderedPageBreak/>
-        <w:t>desenvolvimento</w:t>
-      </w:r>
-      <w:r>
-        <w:t>.</w:t>
-      </w:r>
-      <w:r>
-        <w:t xml:space="preserve"> A seguir faremos uma breve descrição das tarefas realizadas dentro de cada fase neste projeto.</w:t>
+        <w:t>A seguir faremos uma breve descrição das tarefas realizadas dentro de cada fase neste projeto.</w:t>
       </w:r>
     </w:p>
     <w:p>
@@ -9100,7 +9293,10 @@
         <w:t>a partir da linha 2 da Figura</w:t>
       </w:r>
       <w:r>
-        <w:t xml:space="preserve"> 2</w:t>
+        <w:t xml:space="preserve"> </w:t>
+      </w:r>
+      <w:r>
+        <w:t>4</w:t>
       </w:r>
       <w:r>
         <w:t xml:space="preserve">, </w:t>
@@ -9134,13 +9330,6 @@
         </w:rPr>
         <w:t xml:space="preserve"> do PU</w:t>
       </w:r>
-    </w:p>
-    <w:p>
-      <w:pPr>
-        <w:rPr>
-          <w:rStyle w:val="Forte"/>
-        </w:rPr>
-      </w:pPr>
     </w:p>
     <w:p>
       <w:r>
@@ -9378,7 +9567,7 @@
       <w:pPr>
         <w:pStyle w:val="Ttulo2"/>
       </w:pPr>
-      <w:bookmarkStart w:id="66" w:name="_Toc210140294"/>
+      <w:bookmarkStart w:id="66" w:name="_Toc213681901"/>
       <w:r>
         <w:t>ARTEFATOS</w:t>
       </w:r>
@@ -9395,122 +9584,183 @@
         <w:t xml:space="preserve"> etc</w:t>
       </w:r>
       <w:r>
-        <w:t>. (</w:t>
+        <w:t xml:space="preserve">. </w:t>
       </w:r>
       <w:sdt>
         <w:sdtPr>
+          <w:rPr>
+            <w:b/>
+            <w:bCs/>
+          </w:rPr>
           <w:id w:val="-1191140662"/>
           <w:citation/>
         </w:sdtPr>
         <w:sdtContent>
           <w:r>
+            <w:rPr>
+              <w:b/>
+              <w:bCs/>
+            </w:rPr>
             <w:fldChar w:fldCharType="begin"/>
           </w:r>
           <w:r>
+            <w:rPr>
+              <w:b/>
+              <w:bCs/>
+            </w:rPr>
             <w:instrText xml:space="preserve"> CITATION Lar01 \l 1046 </w:instrText>
           </w:r>
           <w:r>
+            <w:rPr>
+              <w:b/>
+              <w:bCs/>
+            </w:rPr>
             <w:fldChar w:fldCharType="separate"/>
           </w:r>
           <w:r>
             <w:rPr>
+              <w:b/>
+              <w:bCs/>
               <w:noProof/>
             </w:rPr>
-            <w:t xml:space="preserve"> LARMAN, 2001</w:t>
+            <w:t xml:space="preserve"> (</w:t>
+          </w:r>
+          <w:hyperlink w:anchor="Lar01" w:history="1">
+            <w:r>
+              <w:rPr>
+                <w:rStyle w:val="Ttulo2Char"/>
+                <w:rFonts w:eastAsia="Calibri"/>
+                <w:b w:val="0"/>
+                <w:bCs/>
+                <w:noProof/>
+                <w:sz w:val="24"/>
+                <w:szCs w:val="24"/>
+              </w:rPr>
+              <w:t>Larman, 2001</w:t>
+            </w:r>
+          </w:hyperlink>
+          <w:r>
+            <w:rPr>
+              <w:b/>
+              <w:bCs/>
+              <w:noProof/>
+            </w:rPr>
+            <w:t>)</w:t>
           </w:r>
           <w:r>
+            <w:rPr>
+              <w:b/>
+              <w:bCs/>
+            </w:rPr>
             <w:fldChar w:fldCharType="end"/>
           </w:r>
         </w:sdtContent>
       </w:sdt>
       <w:r>
+        <w:t>.</w:t>
+      </w:r>
+      <w:r>
+        <w:t xml:space="preserve"> As</w:t>
+      </w:r>
+      <w:r>
+        <w:t xml:space="preserve"> disciplina</w:t>
+      </w:r>
+      <w:r>
+        <w:t>s</w:t>
+      </w:r>
+      <w:r>
+        <w:t xml:space="preserve"> do PU pode</w:t>
+      </w:r>
+      <w:r>
+        <w:t>m</w:t>
+      </w:r>
+      <w:r>
+        <w:t xml:space="preserve"> gerar um ou mais artefatos</w:t>
+      </w:r>
+      <w:r>
+        <w:t xml:space="preserve"> que </w:t>
+      </w:r>
+      <w:r>
+        <w:t>s</w:t>
+      </w:r>
+      <w:r>
+        <w:t>ão</w:t>
+      </w:r>
+      <w:r>
+        <w:t xml:space="preserve"> controlados e </w:t>
+      </w:r>
+      <w:r>
+        <w:t>gerenciados</w:t>
+      </w:r>
+      <w:r>
+        <w:t xml:space="preserve"> durante o </w:t>
+      </w:r>
+      <w:r>
+        <w:t xml:space="preserve">ciclo de </w:t>
+      </w:r>
+      <w:r>
+        <w:t>desenvolvimento</w:t>
+      </w:r>
+      <w:r>
+        <w:t>.</w:t>
+      </w:r>
+      <w:r>
+        <w:t xml:space="preserve"> </w:t>
+      </w:r>
+    </w:p>
+    <w:p>
+      <w:r>
+        <w:tab/>
+      </w:r>
+      <w:r>
+        <w:t>A Tabela</w:t>
+      </w:r>
+      <w:r>
+        <w:t xml:space="preserve"> </w:t>
+      </w:r>
+      <w:r>
+        <w:t>2</w:t>
+      </w:r>
+      <w:r>
+        <w:t xml:space="preserve"> mostra </w:t>
+      </w:r>
+      <w:r>
+        <w:t>os</w:t>
+      </w:r>
+      <w:r>
+        <w:t xml:space="preserve"> artefatos, bem como as disciplinas e fases onde </w:t>
+      </w:r>
+      <w:r>
+        <w:t>estes serão</w:t>
+      </w:r>
+      <w:r>
+        <w:t xml:space="preserve"> </w:t>
+      </w:r>
+      <w:r>
+        <w:t>produzidos</w:t>
+      </w:r>
+      <w:r>
+        <w:t xml:space="preserve"> (</w:t>
+      </w:r>
+      <w:r>
+        <w:rPr>
+          <w:b/>
+          <w:bCs/>
+        </w:rPr>
+        <w:t>p</w:t>
+      </w:r>
+      <w:r>
+        <w:t>) e/ou refinado (</w:t>
+      </w:r>
+      <w:r>
+        <w:rPr>
+          <w:b/>
+          <w:bCs/>
+        </w:rPr>
+        <w:t>r</w:t>
+      </w:r>
+      <w:r>
         <w:t>)</w:t>
-      </w:r>
-      <w:r>
-        <w:t>.</w:t>
-      </w:r>
-      <w:r>
-        <w:t xml:space="preserve"> As</w:t>
-      </w:r>
-      <w:r>
-        <w:t xml:space="preserve"> disciplina</w:t>
-      </w:r>
-      <w:r>
-        <w:t>s</w:t>
-      </w:r>
-      <w:r>
-        <w:t xml:space="preserve"> do PU pode</w:t>
-      </w:r>
-      <w:r>
-        <w:t>m</w:t>
-      </w:r>
-      <w:r>
-        <w:t xml:space="preserve"> gerar um ou mais artefatos</w:t>
-      </w:r>
-      <w:r>
-        <w:t xml:space="preserve"> que </w:t>
-      </w:r>
-      <w:r>
-        <w:t>s</w:t>
-      </w:r>
-      <w:r>
-        <w:t>ão</w:t>
-      </w:r>
-      <w:r>
-        <w:t xml:space="preserve"> controlados e </w:t>
-      </w:r>
-      <w:r>
-        <w:t>gerenciados</w:t>
-      </w:r>
-      <w:r>
-        <w:t xml:space="preserve"> durante o </w:t>
-      </w:r>
-      <w:r>
-        <w:t xml:space="preserve">ciclo de </w:t>
-      </w:r>
-      <w:r>
-        <w:t>desenvolvimento</w:t>
-      </w:r>
-      <w:r>
-        <w:t>.</w:t>
-      </w:r>
-      <w:r>
-        <w:t xml:space="preserve"> </w:t>
-      </w:r>
-    </w:p>
-    <w:p>
-      <w:r>
-        <w:tab/>
-      </w:r>
-      <w:r>
-        <w:t>A Tabela</w:t>
-      </w:r>
-      <w:r>
-        <w:t xml:space="preserve"> </w:t>
-      </w:r>
-      <w:r>
-        <w:t>2</w:t>
-      </w:r>
-      <w:r>
-        <w:t xml:space="preserve"> mostra </w:t>
-      </w:r>
-      <w:r>
-        <w:t>os</w:t>
-      </w:r>
-      <w:r>
-        <w:t xml:space="preserve"> artefatos, bem como as disciplinas e fases onde </w:t>
-      </w:r>
-      <w:r>
-        <w:t>estes serão</w:t>
-      </w:r>
-      <w:r>
-        <w:t xml:space="preserve"> </w:t>
-      </w:r>
-      <w:r>
-        <w:t>produzidos</w:t>
-      </w:r>
-      <w:r>
-        <w:t xml:space="preserve"> (p) e/ou refinado (r)</w:t>
       </w:r>
       <w:r>
         <w:t xml:space="preserve"> durante este projeto</w:t>
@@ -9525,7 +9775,7 @@
         <w:pStyle w:val="Legenda"/>
         <w:keepNext/>
       </w:pPr>
-      <w:bookmarkStart w:id="67" w:name="_Toc210140267"/>
+      <w:bookmarkStart w:id="67" w:name="_Toc213681854"/>
       <w:r>
         <w:t xml:space="preserve">Tabela </w:t>
       </w:r>
@@ -10912,7 +11162,7 @@
       <w:bookmarkStart w:id="68" w:name="_Toc175218599"/>
       <w:bookmarkStart w:id="69" w:name="_Toc175231789"/>
       <w:bookmarkStart w:id="70" w:name="_Toc175908734"/>
-      <w:bookmarkStart w:id="71" w:name="_Toc210140295"/>
+      <w:bookmarkStart w:id="71" w:name="_Toc213681902"/>
       <w:r>
         <w:lastRenderedPageBreak/>
         <w:t>RESULTADOS ESPERADOS</w:t>
@@ -11212,7 +11462,7 @@
       <w:pPr>
         <w:pStyle w:val="Ttulo1"/>
       </w:pPr>
-      <w:bookmarkStart w:id="75" w:name="_Toc210140296"/>
+      <w:bookmarkStart w:id="75" w:name="_Toc213681903"/>
       <w:r>
         <w:lastRenderedPageBreak/>
         <w:t>CRONOGRAMA DE ATIVIDADES</w:t>
@@ -11232,33 +11482,26 @@
         <w:pStyle w:val="Legenda"/>
         <w:keepNext/>
       </w:pPr>
-      <w:bookmarkStart w:id="76" w:name="_Toc210140268"/>
+      <w:bookmarkStart w:id="76" w:name="_Toc213681855"/>
       <w:r>
         <w:t xml:space="preserve">Tabela </w:t>
       </w:r>
-      <w:r>
-        <w:fldChar w:fldCharType="begin"/>
-      </w:r>
-      <w:r>
-        <w:instrText xml:space="preserve"> SEQ Tabela \* ARABIC </w:instrText>
-      </w:r>
-      <w:r>
-        <w:fldChar w:fldCharType="separate"/>
-      </w:r>
-      <w:r>
-        <w:rPr>
-          <w:noProof/>
-        </w:rPr>
-        <w:t>3</w:t>
-      </w:r>
-      <w:r>
-        <w:rPr>
-          <w:noProof/>
-        </w:rPr>
-        <w:fldChar w:fldCharType="end"/>
-      </w:r>
-      <w:r>
-        <w:t>: cronograma atividades</w:t>
+      <w:fldSimple w:instr=" SEQ Tabela \* ARABIC ">
+        <w:r>
+          <w:rPr>
+            <w:noProof/>
+          </w:rPr>
+          <w:t>3</w:t>
+        </w:r>
+      </w:fldSimple>
+      <w:r>
+        <w:t xml:space="preserve">: cronograma </w:t>
+      </w:r>
+      <w:r>
+        <w:t xml:space="preserve">de </w:t>
+      </w:r>
+      <w:r>
+        <w:t>atividades</w:t>
       </w:r>
       <w:bookmarkEnd w:id="76"/>
     </w:p>
@@ -11400,7 +11643,7 @@
               <w:rPr>
                 <w:sz w:val="20"/>
               </w:rPr>
-              <w:t>FEV.</w:t>
+              <w:t>MAIO</w:t>
             </w:r>
           </w:p>
         </w:tc>
@@ -11419,7 +11662,7 @@
               <w:rPr>
                 <w:sz w:val="20"/>
               </w:rPr>
-              <w:t>MAR.</w:t>
+              <w:t>JUN.</w:t>
             </w:r>
           </w:p>
         </w:tc>
@@ -11438,7 +11681,7 @@
               <w:rPr>
                 <w:sz w:val="20"/>
               </w:rPr>
-              <w:t>ABR.</w:t>
+              <w:t>JUL.</w:t>
             </w:r>
           </w:p>
         </w:tc>
@@ -11457,7 +11700,7 @@
               <w:rPr>
                 <w:sz w:val="20"/>
               </w:rPr>
-              <w:t>MAIO</w:t>
+              <w:t>AGO.</w:t>
             </w:r>
           </w:p>
         </w:tc>
@@ -11476,7 +11719,7 @@
               <w:rPr>
                 <w:sz w:val="20"/>
               </w:rPr>
-              <w:t>JUN.</w:t>
+              <w:t>SET.</w:t>
             </w:r>
           </w:p>
         </w:tc>
@@ -11495,7 +11738,7 @@
               <w:rPr>
                 <w:sz w:val="20"/>
               </w:rPr>
-              <w:t>JUL.</w:t>
+              <w:t>OUT.</w:t>
             </w:r>
           </w:p>
         </w:tc>
@@ -11514,7 +11757,7 @@
               <w:rPr>
                 <w:sz w:val="20"/>
               </w:rPr>
-              <w:t>AGO.</w:t>
+              <w:t>NOV</w:t>
             </w:r>
           </w:p>
         </w:tc>
@@ -11533,7 +11776,7 @@
               <w:rPr>
                 <w:sz w:val="20"/>
               </w:rPr>
-              <w:t>SET.</w:t>
+              <w:t>DEZ</w:t>
             </w:r>
           </w:p>
         </w:tc>
@@ -11552,7 +11795,7 @@
               <w:rPr>
                 <w:sz w:val="20"/>
               </w:rPr>
-              <w:t>OUT.</w:t>
+              <w:t>JAN</w:t>
             </w:r>
           </w:p>
         </w:tc>
@@ -11574,7 +11817,7 @@
               <w:rPr>
                 <w:sz w:val="20"/>
               </w:rPr>
-              <w:t>NOV</w:t>
+              <w:t>FEV</w:t>
             </w:r>
           </w:p>
         </w:tc>
@@ -11647,7 +11890,7 @@
             <w:tcBorders>
               <w:left w:val="single" w:sz="4" w:space="0" w:color="auto"/>
             </w:tcBorders>
-            <w:shd w:val="clear" w:color="auto" w:fill="FFFFFF" w:themeFill="background1"/>
+            <w:shd w:val="clear" w:color="auto" w:fill="DDDDDD" w:themeFill="accent1"/>
           </w:tcPr>
           <w:p>
             <w:pPr>
@@ -11662,7 +11905,7 @@
         <w:tc>
           <w:tcPr>
             <w:tcW w:w="850" w:type="dxa"/>
-            <w:shd w:val="clear" w:color="auto" w:fill="FFFFFF" w:themeFill="background1"/>
+            <w:shd w:val="clear" w:color="auto" w:fill="DDDDDD" w:themeFill="accent1"/>
           </w:tcPr>
           <w:p>
             <w:pPr>
@@ -11692,7 +11935,7 @@
         <w:tc>
           <w:tcPr>
             <w:tcW w:w="838" w:type="dxa"/>
-            <w:shd w:val="clear" w:color="auto" w:fill="D9D9D9" w:themeFill="background1" w:themeFillShade="D9"/>
+            <w:shd w:val="clear" w:color="auto" w:fill="FFFFFF" w:themeFill="background1"/>
           </w:tcPr>
           <w:p>
             <w:pPr>
@@ -11707,7 +11950,7 @@
         <w:tc>
           <w:tcPr>
             <w:tcW w:w="838" w:type="dxa"/>
-            <w:shd w:val="clear" w:color="auto" w:fill="D9D9D9" w:themeFill="background1" w:themeFillShade="D9"/>
+            <w:shd w:val="clear" w:color="auto" w:fill="FFFFFF" w:themeFill="background1"/>
           </w:tcPr>
           <w:p>
             <w:pPr>
@@ -11881,7 +12124,22 @@
         <w:tc>
           <w:tcPr>
             <w:tcW w:w="694" w:type="dxa"/>
-            <w:shd w:val="clear" w:color="auto" w:fill="FFFFFF" w:themeFill="background1"/>
+            <w:shd w:val="clear" w:color="auto" w:fill="DDDDDD" w:themeFill="accent1"/>
+          </w:tcPr>
+          <w:p>
+            <w:pPr>
+              <w:jc w:val="center"/>
+              <w:rPr>
+                <w:rFonts w:ascii="Times New Roman"/>
+                <w:sz w:val="20"/>
+              </w:rPr>
+            </w:pPr>
+          </w:p>
+        </w:tc>
+        <w:tc>
+          <w:tcPr>
+            <w:tcW w:w="838" w:type="dxa"/>
+            <w:shd w:val="clear" w:color="auto" w:fill="DDDDDD" w:themeFill="accent1"/>
           </w:tcPr>
           <w:p>
             <w:pPr>
@@ -11910,23 +12168,8 @@
         </w:tc>
         <w:tc>
           <w:tcPr>
-            <w:tcW w:w="838" w:type="dxa"/>
+            <w:tcW w:w="695" w:type="dxa"/>
             <w:shd w:val="clear" w:color="auto" w:fill="FFFFFF" w:themeFill="background1"/>
-          </w:tcPr>
-          <w:p>
-            <w:pPr>
-              <w:jc w:val="center"/>
-              <w:rPr>
-                <w:rFonts w:ascii="Times New Roman"/>
-                <w:sz w:val="20"/>
-              </w:rPr>
-            </w:pPr>
-          </w:p>
-        </w:tc>
-        <w:tc>
-          <w:tcPr>
-            <w:tcW w:w="695" w:type="dxa"/>
-            <w:shd w:val="clear" w:color="auto" w:fill="D9D9D9" w:themeFill="background1" w:themeFillShade="D9"/>
           </w:tcPr>
           <w:p>
             <w:pPr>
@@ -11941,7 +12184,7 @@
         <w:tc>
           <w:tcPr>
             <w:tcW w:w="702" w:type="dxa"/>
-            <w:shd w:val="clear" w:color="auto" w:fill="D9D9D9" w:themeFill="background1" w:themeFillShade="D9"/>
+            <w:shd w:val="clear" w:color="auto" w:fill="FFFFFF" w:themeFill="background1"/>
           </w:tcPr>
           <w:p>
             <w:pPr>
@@ -12129,7 +12372,7 @@
         <w:tc>
           <w:tcPr>
             <w:tcW w:w="838" w:type="dxa"/>
-            <w:shd w:val="clear" w:color="auto" w:fill="FFFFFF" w:themeFill="background1"/>
+            <w:shd w:val="clear" w:color="auto" w:fill="DDDDDD" w:themeFill="accent1"/>
           </w:tcPr>
           <w:p>
             <w:pPr>
@@ -12144,7 +12387,7 @@
         <w:tc>
           <w:tcPr>
             <w:tcW w:w="695" w:type="dxa"/>
-            <w:shd w:val="clear" w:color="auto" w:fill="FFFFFF" w:themeFill="background1"/>
+            <w:shd w:val="clear" w:color="auto" w:fill="DDDDDD" w:themeFill="accent1"/>
           </w:tcPr>
           <w:p>
             <w:pPr>
@@ -12159,7 +12402,7 @@
         <w:tc>
           <w:tcPr>
             <w:tcW w:w="702" w:type="dxa"/>
-            <w:shd w:val="clear" w:color="auto" w:fill="FFFFFF" w:themeFill="background1"/>
+            <w:shd w:val="clear" w:color="auto" w:fill="DDDDDD" w:themeFill="accent1"/>
           </w:tcPr>
           <w:p>
             <w:pPr>
@@ -12174,7 +12417,7 @@
         <w:tc>
           <w:tcPr>
             <w:tcW w:w="781" w:type="dxa"/>
-            <w:shd w:val="clear" w:color="auto" w:fill="D9D9D9" w:themeFill="background1" w:themeFillShade="D9"/>
+            <w:shd w:val="clear" w:color="auto" w:fill="FFFFFF" w:themeFill="background1"/>
           </w:tcPr>
           <w:p>
             <w:pPr>
@@ -12189,7 +12432,7 @@
         <w:tc>
           <w:tcPr>
             <w:tcW w:w="661" w:type="dxa"/>
-            <w:shd w:val="clear" w:color="auto" w:fill="D9D9D9" w:themeFill="background1" w:themeFillShade="D9"/>
+            <w:shd w:val="clear" w:color="auto" w:fill="FFFFFF" w:themeFill="background1"/>
           </w:tcPr>
           <w:p>
             <w:pPr>
@@ -12348,7 +12591,7 @@
         <w:tc>
           <w:tcPr>
             <w:tcW w:w="702" w:type="dxa"/>
-            <w:shd w:val="clear" w:color="auto" w:fill="FFFFFF" w:themeFill="background1"/>
+            <w:shd w:val="clear" w:color="auto" w:fill="DDDDDD" w:themeFill="accent1"/>
           </w:tcPr>
           <w:p>
             <w:pPr>
@@ -12552,7 +12795,7 @@
         <w:tc>
           <w:tcPr>
             <w:tcW w:w="781" w:type="dxa"/>
-            <w:shd w:val="clear" w:color="auto" w:fill="FFFFFF" w:themeFill="background1"/>
+            <w:shd w:val="clear" w:color="auto" w:fill="DDDDDD" w:themeFill="accent1"/>
           </w:tcPr>
           <w:p>
             <w:pPr>
@@ -12785,7 +13028,7 @@
         <w:tc>
           <w:tcPr>
             <w:tcW w:w="781" w:type="dxa"/>
-            <w:shd w:val="clear" w:color="auto" w:fill="FFFFFF" w:themeFill="background1"/>
+            <w:shd w:val="clear" w:color="auto" w:fill="DDDDDD" w:themeFill="accent1"/>
           </w:tcPr>
           <w:p>
             <w:pPr>
@@ -12859,7 +13102,7 @@
                 <w:sz w:val="20"/>
                 <w:lang w:val="pt-BR"/>
               </w:rPr>
-              <w:t>Execução e escrita do</w:t>
+              <w:t>Execução do</w:t>
             </w:r>
             <w:r>
               <w:rPr>
@@ -12996,7 +13239,7 @@
         <w:tc>
           <w:tcPr>
             <w:tcW w:w="781" w:type="dxa"/>
-            <w:shd w:val="clear" w:color="auto" w:fill="FFFFFF" w:themeFill="background1"/>
+            <w:shd w:val="clear" w:color="auto" w:fill="DDDDDD" w:themeFill="accent1"/>
           </w:tcPr>
           <w:p>
             <w:pPr>
@@ -13012,7 +13255,7 @@
         <w:tc>
           <w:tcPr>
             <w:tcW w:w="661" w:type="dxa"/>
-            <w:shd w:val="clear" w:color="auto" w:fill="FFFFFF" w:themeFill="background1"/>
+            <w:shd w:val="clear" w:color="auto" w:fill="DDDDDD" w:themeFill="accent1"/>
           </w:tcPr>
           <w:p>
             <w:pPr>
@@ -13031,7 +13274,7 @@
             <w:tcBorders>
               <w:right w:val="single" w:sz="4" w:space="0" w:color="auto"/>
             </w:tcBorders>
-            <w:shd w:val="clear" w:color="auto" w:fill="FFFFFF" w:themeFill="background1"/>
+            <w:shd w:val="clear" w:color="auto" w:fill="DDDDDD" w:themeFill="accent1"/>
           </w:tcPr>
           <w:p>
             <w:pPr>
@@ -13221,7 +13464,7 @@
             <w:tcBorders>
               <w:right w:val="single" w:sz="4" w:space="0" w:color="auto"/>
             </w:tcBorders>
-            <w:shd w:val="clear" w:color="auto" w:fill="FFFFFF" w:themeFill="background1"/>
+            <w:shd w:val="clear" w:color="auto" w:fill="DDDDDD" w:themeFill="accent1"/>
           </w:tcPr>
           <w:p>
             <w:pPr>
@@ -13410,7 +13653,7 @@
             <w:tcBorders>
               <w:right w:val="single" w:sz="4" w:space="0" w:color="auto"/>
             </w:tcBorders>
-            <w:shd w:val="clear" w:color="auto" w:fill="FFFFFF" w:themeFill="background1"/>
+            <w:shd w:val="clear" w:color="auto" w:fill="DDDDDD" w:themeFill="accent1"/>
           </w:tcPr>
           <w:p>
             <w:pPr>
@@ -13455,7 +13698,7 @@
         </w:rPr>
       </w:pPr>
       <w:bookmarkStart w:id="77" w:name="_Toc175908738"/>
-      <w:bookmarkStart w:id="78" w:name="_Toc210140297"/>
+      <w:bookmarkStart w:id="78" w:name="_Toc213681904"/>
       <w:r>
         <w:rPr>
           <w:rStyle w:val="Ttulo1Char"/>
@@ -13488,7 +13731,6 @@
             <w:pStyle w:val="Bibliografia"/>
             <w:rPr>
               <w:noProof/>
-              <w:lang w:val="en-US"/>
             </w:rPr>
           </w:pPr>
           <w:r>
@@ -13503,29 +13745,28 @@
           <w:r>
             <w:fldChar w:fldCharType="separate"/>
           </w:r>
+          <w:bookmarkStart w:id="81" w:name="Den15"/>
           <w:r>
             <w:rPr>
               <w:noProof/>
-              <w:lang w:val="en-US"/>
             </w:rPr>
-            <w:t xml:space="preserve">DENNIS, A.; WIXOM, B. H.; TEGARDEN, D. </w:t>
+            <w:t xml:space="preserve">Dennis, Alan; Wixom, Barbara Haley; Tegarden, David. </w:t>
           </w:r>
           <w:r>
             <w:rPr>
               <w:b/>
               <w:bCs/>
               <w:noProof/>
-              <w:lang w:val="en-US"/>
             </w:rPr>
             <w:t>System Analysis &amp; Design:</w:t>
           </w:r>
           <w:r>
             <w:rPr>
               <w:noProof/>
-              <w:lang w:val="en-US"/>
             </w:rPr>
             <w:t xml:space="preserve"> An Object Oriented Approach with UML. 5ª. ed. [S.l.]: Wiley, 2015.</w:t>
           </w:r>
+          <w:bookmarkEnd w:id="81"/>
         </w:p>
         <w:p>
           <w:pPr>
@@ -13534,35 +13775,28 @@
               <w:noProof/>
             </w:rPr>
           </w:pPr>
+          <w:bookmarkStart w:id="82" w:name="Lar01"/>
           <w:r>
             <w:rPr>
               <w:noProof/>
-              <w:lang w:val="en-US"/>
             </w:rPr>
-            <w:t xml:space="preserve">LARMAN, C. </w:t>
+            <w:t xml:space="preserve">Larman, C. </w:t>
           </w:r>
           <w:r>
             <w:rPr>
               <w:b/>
               <w:bCs/>
               <w:noProof/>
-              <w:lang w:val="en-US"/>
             </w:rPr>
             <w:t>Applying UML and Patterns:</w:t>
           </w:r>
           <w:r>
             <w:rPr>
               <w:noProof/>
-              <w:lang w:val="en-US"/>
             </w:rPr>
-            <w:t xml:space="preserve"> An Introduction to Object-Oriented Analysis and Design and the Unified Process. </w:t>
+            <w:t xml:space="preserve"> An Introduction to Object-Oriented Analysis and Design and the Unified Process. 2ª. ed. [S.l.]: Prentice Hall, 2001. 616 p.</w:t>
           </w:r>
-          <w:r>
-            <w:rPr>
-              <w:noProof/>
-            </w:rPr>
-            <w:t>2ª. ed. [S.l.]: Prentice Hall, 2001. p. 616.</w:t>
-          </w:r>
+          <w:bookmarkEnd w:id="82"/>
         </w:p>
         <w:p>
           <w:pPr>
@@ -13571,43 +13805,14 @@
               <w:noProof/>
             </w:rPr>
           </w:pPr>
+          <w:bookmarkStart w:id="83" w:name="Nun20"/>
           <w:r>
             <w:rPr>
               <w:noProof/>
             </w:rPr>
-            <w:t>NUNES, D. B.; GUERRA, L. B.; CORREA, C. M. Design Thinking como Metodologia para Definição Interface Gráfica de Usuário, São Borja, julho 2020., p. 4</w:t>
+            <w:t>Nunes, Daila B.; Guerra, Lucieli B.; Correa, Claiton M. Design Thinking como Metodologia para Definição Interface Gráfica de Usuário, São Borja, julho 2020. 4.</w:t>
           </w:r>
-        </w:p>
-        <w:p>
-          <w:pPr>
-            <w:rPr>
-              <w:noProof/>
-              <w:lang w:val="en-US"/>
-            </w:rPr>
-          </w:pPr>
-          <w:r>
-            <w:rPr>
-              <w:noProof/>
-              <w:lang w:val="en-US"/>
-            </w:rPr>
-            <w:t xml:space="preserve">PRESMMAN, R. </w:t>
-          </w:r>
-          <w:r>
-            <w:rPr>
-              <w:b/>
-              <w:bCs/>
-              <w:noProof/>
-              <w:lang w:val="en-US"/>
-            </w:rPr>
-            <w:t>Software Engineering:</w:t>
-          </w:r>
-          <w:r>
-            <w:rPr>
-              <w:noProof/>
-              <w:lang w:val="en-US"/>
-            </w:rPr>
-            <w:t xml:space="preserve"> A practitioner's approach. 8ª. ed. New York: McGraw-Hill Education, 2015.</w:t>
-          </w:r>
+          <w:bookmarkEnd w:id="83"/>
         </w:p>
         <w:p>
           <w:pPr>
@@ -13616,36 +13821,663 @@
               <w:noProof/>
             </w:rPr>
           </w:pPr>
+          <w:bookmarkStart w:id="84" w:name="Rog15"/>
           <w:r>
             <w:rPr>
               <w:noProof/>
-              <w:lang w:val="en-US"/>
             </w:rPr>
-            <w:t xml:space="preserve">SOMMERVILLE, Y. </w:t>
+            <w:t xml:space="preserve">Presmman, Roger. </w:t>
           </w:r>
           <w:r>
             <w:rPr>
               <w:b/>
               <w:bCs/>
               <w:noProof/>
-              <w:lang w:val="en-US"/>
+            </w:rPr>
+            <w:t>Software Engineering:</w:t>
+          </w:r>
+          <w:r>
+            <w:rPr>
+              <w:noProof/>
+            </w:rPr>
+            <w:t xml:space="preserve"> A practitioner's approach. 8ª. ed. New York: McGraw-Hill Education, 2015.</w:t>
+          </w:r>
+          <w:bookmarkEnd w:id="84"/>
+        </w:p>
+        <w:p>
+          <w:pPr>
+            <w:pStyle w:val="Bibliografia"/>
+            <w:rPr>
+              <w:noProof/>
+            </w:rPr>
+          </w:pPr>
+          <w:bookmarkStart w:id="85" w:name="Som16"/>
+          <w:r>
+            <w:rPr>
+              <w:noProof/>
+            </w:rPr>
+            <w:t xml:space="preserve">Sommerville, Yan. </w:t>
+          </w:r>
+          <w:r>
+            <w:rPr>
+              <w:b/>
+              <w:bCs/>
+              <w:noProof/>
             </w:rPr>
             <w:t>Software Engineering</w:t>
           </w:r>
           <w:r>
             <w:rPr>
               <w:noProof/>
-              <w:lang w:val="en-US"/>
             </w:rPr>
-            <w:t xml:space="preserve">. 10ª. ed. </w:t>
+            <w:t>. 9ª. ed. [S.l.]: Pearson Education, 2011.</w:t>
+          </w:r>
+          <w:bookmarkEnd w:id="85"/>
+        </w:p>
+        <w:p>
+          <w:pPr>
+            <w:spacing w:line="240" w:lineRule="auto"/>
+            <w:jc w:val="left"/>
+          </w:pPr>
+          <w:r>
+            <w:rPr>
+              <w:noProof/>
+            </w:rPr>
+            <w:t xml:space="preserve">ANDRADE, G. M. et al. </w:t>
+          </w:r>
+          <w:r>
+            <w:rPr>
+              <w:b/>
+              <w:bCs/>
+              <w:noProof/>
+            </w:rPr>
+            <w:t>Relato de Experiência</w:t>
           </w:r>
           <w:r>
             <w:rPr>
               <w:noProof/>
             </w:rPr>
-            <w:t>[S.l.]: Pearson Education, 2016.</w:t>
+            <w:t>: Projeto de Extensão: Curso UX e     UI Design. Revista Extensão em Foco, v. 11, n. 1, p. 170–182, jan./jun. 2021.</w:t>
           </w:r>
         </w:p>
+        <w:p>
+          <w:pPr>
+            <w:rPr>
+              <w:noProof/>
+            </w:rPr>
+          </w:pPr>
+          <w:r>
+            <w:rPr>
+              <w:noProof/>
+            </w:rPr>
+            <w:t xml:space="preserve">BROWN, T. </w:t>
+          </w:r>
+          <w:r>
+            <w:rPr>
+              <w:b/>
+              <w:bCs/>
+              <w:noProof/>
+            </w:rPr>
+            <w:t>Design Thinking:</w:t>
+          </w:r>
+          <w:r>
+            <w:rPr>
+              <w:noProof/>
+            </w:rPr>
+            <w:t xml:space="preserve"> uma metodologia poderosa para decretar o fim das velhas ideias. Rio de Janeiro: Elsevier, 2009.</w:t>
+          </w:r>
+        </w:p>
+        <w:p>
+          <w:pPr>
+            <w:rPr>
+              <w:noProof/>
+            </w:rPr>
+          </w:pPr>
+          <w:r>
+            <w:rPr>
+              <w:noProof/>
+            </w:rPr>
+            <w:t>CHAVES, I. G</w:t>
+          </w:r>
+          <w:r>
+            <w:rPr>
+              <w:b/>
+              <w:bCs/>
+              <w:noProof/>
+            </w:rPr>
+            <w:t>. Product experience e requisitos não funcionais:</w:t>
+          </w:r>
+          <w:r>
+            <w:rPr>
+              <w:noProof/>
+            </w:rPr>
+            <w:t xml:space="preserve"> um framework de design e sua contribuição à engenharia de requisitos. 176 f. Tese (Doutorado em Design) – Universidade Federal de Pernambuco, Recife, 2016.</w:t>
+          </w:r>
+        </w:p>
+        <w:p>
+          <w:pPr>
+            <w:rPr>
+              <w:noProof/>
+            </w:rPr>
+          </w:pPr>
+          <w:r>
+            <w:rPr>
+              <w:noProof/>
+            </w:rPr>
+            <w:t xml:space="preserve">COSTA, F. A.; SANTOS, R. L.; MOURA, P. V. </w:t>
+          </w:r>
+          <w:r>
+            <w:rPr>
+              <w:b/>
+              <w:bCs/>
+              <w:noProof/>
+            </w:rPr>
+            <w:t xml:space="preserve">A centralização de informações acadêmicas por meio de plataformas digitais: </w:t>
+          </w:r>
+          <w:r>
+            <w:rPr>
+              <w:noProof/>
+            </w:rPr>
+            <w:t>desafios e benefícios. Revista Brasileira de Educação e Tecnologia, v. 13, n. 2, p. 45–58, 2020.</w:t>
+          </w:r>
+        </w:p>
+        <w:p>
+          <w:pPr>
+            <w:rPr>
+              <w:noProof/>
+            </w:rPr>
+          </w:pPr>
+          <w:r>
+            <w:rPr>
+              <w:noProof/>
+            </w:rPr>
+            <w:t xml:space="preserve">DEVMEDIA. </w:t>
+          </w:r>
+          <w:r>
+            <w:rPr>
+              <w:b/>
+              <w:bCs/>
+              <w:noProof/>
+            </w:rPr>
+            <w:t>O que é UML e diagramas de caso de uso:</w:t>
+          </w:r>
+          <w:r>
+            <w:rPr>
+              <w:noProof/>
+            </w:rPr>
+            <w:t xml:space="preserve"> introdução prática à UML. Disponível em: </w:t>
+          </w:r>
+          <w:hyperlink r:id="rId16" w:history="1">
+            <w:r>
+              <w:rPr>
+                <w:noProof/>
+              </w:rPr>
+              <w:t>https://www.devmedia.com.br/o-que-e-uml-e-diagramas-de-caso-de-uso-introducao-pratica-a-uml/23408</w:t>
+            </w:r>
+          </w:hyperlink>
+          <w:r>
+            <w:rPr>
+              <w:noProof/>
+            </w:rPr>
+            <w:t>. Acesso em: 1 jun. 2025.</w:t>
+          </w:r>
+        </w:p>
+        <w:p>
+          <w:pPr>
+            <w:rPr>
+              <w:noProof/>
+            </w:rPr>
+          </w:pPr>
+          <w:r>
+            <w:rPr>
+              <w:noProof/>
+            </w:rPr>
+            <w:t xml:space="preserve">FERREIRA, J. V.; OLIVEIRA, S. R. B.; PORTELA, C. S. </w:t>
+          </w:r>
+          <w:r>
+            <w:rPr>
+              <w:b/>
+              <w:bCs/>
+              <w:noProof/>
+            </w:rPr>
+            <w:t>Experiência do usuário e requisitos não funcionais de software no ensino interdisciplinar de interação humano-computador e Engenharia de Software:</w:t>
+          </w:r>
+          <w:r>
+            <w:rPr>
+              <w:noProof/>
+            </w:rPr>
+            <w:t xml:space="preserve"> uma revisão sistemática da literatura. 2024.</w:t>
+          </w:r>
+        </w:p>
+        <w:p>
+          <w:pPr>
+            <w:rPr>
+              <w:noProof/>
+            </w:rPr>
+          </w:pPr>
+          <w:r>
+            <w:rPr>
+              <w:noProof/>
+            </w:rPr>
+            <w:t xml:space="preserve">KRUCHTEN, P. </w:t>
+          </w:r>
+          <w:r>
+            <w:rPr>
+              <w:b/>
+              <w:bCs/>
+              <w:noProof/>
+            </w:rPr>
+            <w:t>The Rational Unified Process: An Introduction. 3ª ed. Boston:</w:t>
+          </w:r>
+          <w:r>
+            <w:rPr>
+              <w:noProof/>
+            </w:rPr>
+            <w:t xml:space="preserve"> Addison-Wesley, 2004.</w:t>
+          </w:r>
+        </w:p>
+        <w:p>
+          <w:pPr>
+            <w:rPr>
+              <w:noProof/>
+            </w:rPr>
+          </w:pPr>
+          <w:r>
+            <w:rPr>
+              <w:noProof/>
+            </w:rPr>
+            <w:lastRenderedPageBreak/>
+            <w:t xml:space="preserve">LARMAN, C. </w:t>
+          </w:r>
+          <w:r>
+            <w:rPr>
+              <w:b/>
+              <w:bCs/>
+              <w:noProof/>
+            </w:rPr>
+            <w:t>Utilizando UML e padrões: uma introdução à análise e ao projeto orientado a objetos e ao desenvolvimento iterativo. 3ª ed. Porto Alegre:</w:t>
+          </w:r>
+          <w:r>
+            <w:rPr>
+              <w:noProof/>
+            </w:rPr>
+            <w:t xml:space="preserve"> Bookman, 2007.</w:t>
+          </w:r>
+        </w:p>
+        <w:p>
+          <w:pPr>
+            <w:rPr>
+              <w:noProof/>
+            </w:rPr>
+          </w:pPr>
+          <w:r>
+            <w:rPr>
+              <w:noProof/>
+            </w:rPr>
+            <w:t xml:space="preserve">LIMA, J. P.; ANDRADE, S. M. </w:t>
+          </w:r>
+          <w:r>
+            <w:rPr>
+              <w:b/>
+              <w:bCs/>
+              <w:noProof/>
+            </w:rPr>
+            <w:t>Personalização e usabilidade em sistemas institucionais:</w:t>
+          </w:r>
+          <w:r>
+            <w:rPr>
+              <w:noProof/>
+            </w:rPr>
+            <w:t xml:space="preserve"> uma abordagem centrada no usuário. Revista de Sistemas e Tecnologia Educacional, v. 9, n. 1, p. 22–34, 2021.</w:t>
+          </w:r>
+        </w:p>
+        <w:p>
+          <w:pPr>
+            <w:rPr>
+              <w:noProof/>
+            </w:rPr>
+          </w:pPr>
+          <w:r>
+            <w:rPr>
+              <w:noProof/>
+            </w:rPr>
+            <w:t xml:space="preserve">LOPES, L. T. </w:t>
+          </w:r>
+          <w:r>
+            <w:rPr>
+              <w:b/>
+              <w:bCs/>
+              <w:noProof/>
+            </w:rPr>
+            <w:t>Um modelo de processo de engenharia de requisitos para ambientes de desenvolvimento distribuído de software.</w:t>
+          </w:r>
+          <w:r>
+            <w:rPr>
+              <w:noProof/>
+            </w:rPr>
+            <w:t xml:space="preserve"> 142 f. Dissertação (Mestrado em Ciência da Computação) – Pontifícia Universidade Católica do Rio Grande do Sul, Porto Alegre, 2005.</w:t>
+          </w:r>
+        </w:p>
+        <w:p>
+          <w:pPr>
+            <w:rPr>
+              <w:noProof/>
+            </w:rPr>
+          </w:pPr>
+          <w:r>
+            <w:rPr>
+              <w:noProof/>
+            </w:rPr>
+            <w:t xml:space="preserve">MACEDO, L.; MEIRELES, M.; FREITAS, M. A. </w:t>
+          </w:r>
+          <w:r>
+            <w:rPr>
+              <w:b/>
+              <w:bCs/>
+              <w:noProof/>
+            </w:rPr>
+            <w:t>A caracterização do Design Thinking como um modelo de inovação.</w:t>
+          </w:r>
+          <w:r>
+            <w:rPr>
+              <w:noProof/>
+            </w:rPr>
+            <w:t xml:space="preserve"> Revista de Administração e Inovação, v. 12, n. 1, p. 45–69, jan./mar. 2015.</w:t>
+          </w:r>
+        </w:p>
+        <w:p>
+          <w:pPr>
+            <w:rPr>
+              <w:noProof/>
+            </w:rPr>
+          </w:pPr>
+          <w:r>
+            <w:rPr>
+              <w:noProof/>
+            </w:rPr>
+            <w:t xml:space="preserve">MARTINS, L. E. G. </w:t>
+          </w:r>
+          <w:r>
+            <w:rPr>
+              <w:b/>
+              <w:bCs/>
+              <w:noProof/>
+            </w:rPr>
+            <w:t>Uma metodologia de elicitação de requisitos de software baseada na Teoria da Atividade.</w:t>
+          </w:r>
+          <w:r>
+            <w:rPr>
+              <w:noProof/>
+            </w:rPr>
+            <w:t xml:space="preserve"> 186 f. Tese (Doutorado em Engenharia de Sistemas e Computação) – Universidade Federal do Rio de Janeiro, Rio de Janeiro, 2010.</w:t>
+          </w:r>
+        </w:p>
+        <w:p>
+          <w:pPr>
+            <w:rPr>
+              <w:noProof/>
+            </w:rPr>
+          </w:pPr>
+          <w:r>
+            <w:rPr>
+              <w:noProof/>
+            </w:rPr>
+            <w:t>MELO, M. A. F.; BRÄSCHER, M.</w:t>
+          </w:r>
+          <w:r>
+            <w:rPr>
+              <w:b/>
+              <w:bCs/>
+              <w:noProof/>
+            </w:rPr>
+            <w:t xml:space="preserve"> Requisitos Funcionais para Dados de Autoridade Assunto (FRSAD): </w:t>
+          </w:r>
+          <w:r>
+            <w:rPr>
+              <w:noProof/>
+            </w:rPr>
+            <w:t>entidades, atributos e relacionamentos. Revista Brasileira de Biblioteconomia, v. 13, n. 1, p. 1–16, jan./abr. 2019.</w:t>
+          </w:r>
+        </w:p>
+        <w:p>
+          <w:pPr>
+            <w:rPr>
+              <w:noProof/>
+            </w:rPr>
+          </w:pPr>
+          <w:r>
+            <w:rPr>
+              <w:b/>
+              <w:bCs/>
+              <w:noProof/>
+            </w:rPr>
+            <w:t>MORENO, F. P.; ARELLANO, M. Á. M. Requisitos funcionais para registros bibliográficos – FRBR: uma apresentação. Brasília:</w:t>
+          </w:r>
+          <w:r>
+            <w:rPr>
+              <w:noProof/>
+            </w:rPr>
+            <w:t xml:space="preserve"> IBICT, 2008.</w:t>
+          </w:r>
+        </w:p>
+        <w:p>
+          <w:pPr>
+            <w:rPr>
+              <w:noProof/>
+            </w:rPr>
+          </w:pPr>
+          <w:r>
+            <w:rPr>
+              <w:noProof/>
+            </w:rPr>
+            <w:t xml:space="preserve">SANTOS, L. M. </w:t>
+          </w:r>
+          <w:r>
+            <w:rPr>
+              <w:b/>
+              <w:bCs/>
+              <w:noProof/>
+            </w:rPr>
+            <w:t>Rational Unified Process:</w:t>
+          </w:r>
+          <w:r>
+            <w:rPr>
+              <w:noProof/>
+            </w:rPr>
+            <w:t xml:space="preserve"> Reduzindo riscos nos projetos de software. Revista Brasileira de Engenharia de Software, v. 12, n. 1, p. 45–60, 2010.</w:t>
+          </w:r>
+        </w:p>
+        <w:p>
+          <w:pPr>
+            <w:rPr>
+              <w:noProof/>
+            </w:rPr>
+          </w:pPr>
+          <w:r>
+            <w:rPr>
+              <w:noProof/>
+            </w:rPr>
+            <w:t xml:space="preserve">SEGURA, M. P.; OCHOA, J. M. </w:t>
+          </w:r>
+          <w:r>
+            <w:rPr>
+              <w:b/>
+              <w:bCs/>
+              <w:noProof/>
+            </w:rPr>
+            <w:t>Considerações acerca del Design Thinking y Procesos</w:t>
+          </w:r>
+          <w:r>
+            <w:rPr>
+              <w:noProof/>
+            </w:rPr>
+            <w:t>. Revista Científica General José María Córdova, v. 13, n. 13, p. 131–149, jul./dez. 2015.</w:t>
+          </w:r>
+        </w:p>
+        <w:p>
+          <w:pPr>
+            <w:rPr>
+              <w:noProof/>
+            </w:rPr>
+          </w:pPr>
+          <w:r>
+            <w:rPr>
+              <w:noProof/>
+            </w:rPr>
+            <w:t xml:space="preserve">SILVA, C. M. L.; SANTOS, G.; ROCHA, A. R. C. </w:t>
+          </w:r>
+          <w:r>
+            <w:rPr>
+              <w:b/>
+              <w:bCs/>
+              <w:noProof/>
+            </w:rPr>
+            <w:t>Uso do sistema de gerenciamento de fluxo de trabalho para apoiar o desenvolvimento de software baseado no processo unificado da Rational estendido para alcançar os níveis 2 e 3 do modelo de maturidade.</w:t>
+          </w:r>
+          <w:r>
+            <w:rPr>
+              <w:noProof/>
+            </w:rPr>
+            <w:t xml:space="preserve"> Journal of Information Systems and Technology Management (JISTEM), v. 3, n. 2, p. 113–136, ago. 2006.</w:t>
+          </w:r>
+        </w:p>
+        <w:p>
+          <w:pPr>
+            <w:rPr>
+              <w:noProof/>
+            </w:rPr>
+          </w:pPr>
+          <w:r>
+            <w:rPr>
+              <w:noProof/>
+            </w:rPr>
+            <w:lastRenderedPageBreak/>
+            <w:t xml:space="preserve">SILVA, M. R.; OLIVEIRA, P. A. </w:t>
+          </w:r>
+          <w:r>
+            <w:rPr>
+              <w:b/>
+              <w:bCs/>
+              <w:noProof/>
+            </w:rPr>
+            <w:t>O estágio supervisionado e sua importância para a formação profissional:</w:t>
+          </w:r>
+          <w:r>
+            <w:rPr>
+              <w:noProof/>
+            </w:rPr>
+            <w:t xml:space="preserve"> uma análise prática. Revista de Educação e Prática Profissional, v. 7, n. 1, p. 55–66, 2018.</w:t>
+          </w:r>
+        </w:p>
+        <w:p>
+          <w:pPr>
+            <w:rPr>
+              <w:noProof/>
+            </w:rPr>
+          </w:pPr>
+          <w:r>
+            <w:rPr>
+              <w:noProof/>
+            </w:rPr>
+            <w:t xml:space="preserve">SILVA, R. T. et al. </w:t>
+          </w:r>
+          <w:r>
+            <w:rPr>
+              <w:b/>
+              <w:bCs/>
+              <w:noProof/>
+            </w:rPr>
+            <w:t>Placy: uma solução UI/UX e front-end para a divulgação de informações em estabelecimentos comerciais.</w:t>
+          </w:r>
+          <w:r>
+            <w:rPr>
+              <w:noProof/>
+            </w:rPr>
+            <w:t xml:space="preserve"> Revista Ibero-americana de Humanidades, Ciências e Educação, v. 7, n. 7, p. 1033–1051, jul. 2021.</w:t>
+          </w:r>
+        </w:p>
+        <w:p>
+          <w:pPr>
+            <w:rPr>
+              <w:noProof/>
+            </w:rPr>
+          </w:pPr>
+          <w:r>
+            <w:rPr>
+              <w:noProof/>
+            </w:rPr>
+            <w:t>SOMMERVILLE, I</w:t>
+          </w:r>
+          <w:r>
+            <w:rPr>
+              <w:b/>
+              <w:bCs/>
+              <w:noProof/>
+            </w:rPr>
+            <w:t xml:space="preserve">. Engenharia de software. </w:t>
+          </w:r>
+          <w:r>
+            <w:rPr>
+              <w:noProof/>
+            </w:rPr>
+            <w:t>10ª ed. São Paulo: Pearson Education do Brasil, 2019.</w:t>
+          </w:r>
+        </w:p>
+        <w:p>
+          <w:pPr>
+            <w:rPr>
+              <w:noProof/>
+            </w:rPr>
+          </w:pPr>
+          <w:r>
+            <w:rPr>
+              <w:noProof/>
+            </w:rPr>
+            <w:t xml:space="preserve">SOUZA, R. L. de et al. </w:t>
+          </w:r>
+          <w:r>
+            <w:rPr>
+              <w:b/>
+              <w:bCs/>
+              <w:noProof/>
+            </w:rPr>
+            <w:t>Mentalidade de Design Thinking:</w:t>
+          </w:r>
+          <w:r>
+            <w:rPr>
+              <w:noProof/>
+            </w:rPr>
+            <w:t xml:space="preserve"> desenvolvimento e validação de escala. Revista Pensamento Contemporâneo em Administração, v. 13, n. 1, p. 1–16, jan./abr. 2019.</w:t>
+          </w:r>
+        </w:p>
+        <w:p>
+          <w:pPr>
+            <w:rPr>
+              <w:noProof/>
+            </w:rPr>
+          </w:pPr>
+          <w:r>
+            <w:rPr>
+              <w:noProof/>
+            </w:rPr>
+            <w:t xml:space="preserve">TAVARES, H. C. A. B.; </w:t>
+          </w:r>
+          <w:r>
+            <w:rPr>
+              <w:b/>
+              <w:bCs/>
+              <w:noProof/>
+            </w:rPr>
+            <w:t>CARVALHO, A. E. S.; CASTRO, J. F. B. Medição de Pontos por Função a partir da Especificação de Requisitos.</w:t>
+          </w:r>
+          <w:r>
+            <w:rPr>
+              <w:noProof/>
+            </w:rPr>
+            <w:t xml:space="preserve"> Rio de Janeiro: Serpro; Universidade Federal de Pernambuco, 2002.</w:t>
+          </w:r>
+        </w:p>
+        <w:p/>
         <w:p>
           <w:pPr>
             <w:spacing w:line="240" w:lineRule="auto"/>
@@ -13657,643 +14489,22 @@
         </w:p>
       </w:sdtContent>
     </w:sdt>
-    <w:p>
-      <w:pPr>
-        <w:spacing w:line="240" w:lineRule="auto"/>
-        <w:jc w:val="left"/>
-      </w:pPr>
-      <w:r>
-        <w:rPr>
-          <w:noProof/>
-        </w:rPr>
-        <w:t xml:space="preserve">ANDRADE, G. M. et al. </w:t>
-      </w:r>
-      <w:r>
-        <w:rPr>
-          <w:b/>
-          <w:bCs/>
-          <w:noProof/>
-        </w:rPr>
-        <w:t>Relato de Experiência</w:t>
-      </w:r>
-      <w:r>
-        <w:rPr>
-          <w:noProof/>
-        </w:rPr>
-        <w:t>: Projeto de Extensão: Curso UX e     UI Design. Revista Extensão em Foco, v. 11, n. 1, p. 170–182, jan./jun. 2021.</w:t>
-      </w:r>
-    </w:p>
-    <w:p>
-      <w:pPr>
-        <w:rPr>
-          <w:noProof/>
-        </w:rPr>
-      </w:pPr>
-      <w:r>
-        <w:rPr>
-          <w:noProof/>
-        </w:rPr>
-        <w:t xml:space="preserve">BROWN, T. </w:t>
-      </w:r>
-      <w:r>
-        <w:rPr>
-          <w:b/>
-          <w:bCs/>
-          <w:noProof/>
-        </w:rPr>
-        <w:t>Design Thinking:</w:t>
-      </w:r>
-      <w:r>
-        <w:rPr>
-          <w:noProof/>
-        </w:rPr>
-        <w:t xml:space="preserve"> uma metodologia poderosa para decretar o fim das velhas ideias. Rio de Janeiro: Elsevier, 2009.</w:t>
-      </w:r>
-    </w:p>
-    <w:p>
-      <w:pPr>
-        <w:rPr>
-          <w:noProof/>
-        </w:rPr>
-      </w:pPr>
-      <w:r>
-        <w:rPr>
-          <w:noProof/>
-        </w:rPr>
-        <w:t>CHAVES, I. G</w:t>
-      </w:r>
-      <w:r>
-        <w:rPr>
-          <w:b/>
-          <w:bCs/>
-          <w:noProof/>
-        </w:rPr>
-        <w:t>. Product experience e requisitos não funcionais:</w:t>
-      </w:r>
-      <w:r>
-        <w:rPr>
-          <w:noProof/>
-        </w:rPr>
-        <w:t xml:space="preserve"> um framework de design e sua contribuição à engenharia de requisitos. 176 f. Tese (Doutorado em Design) – Universidade Federal de Pernambuco, Recife, 2016.</w:t>
-      </w:r>
-    </w:p>
-    <w:p>
-      <w:pPr>
-        <w:rPr>
-          <w:noProof/>
-        </w:rPr>
-      </w:pPr>
-      <w:r>
-        <w:rPr>
-          <w:noProof/>
-        </w:rPr>
-        <w:t xml:space="preserve">COSTA, F. A.; SANTOS, R. L.; MOURA, P. V. </w:t>
-      </w:r>
-      <w:r>
-        <w:rPr>
-          <w:b/>
-          <w:bCs/>
-          <w:noProof/>
-        </w:rPr>
-        <w:t xml:space="preserve">A centralização de informações acadêmicas por meio de plataformas digitais: </w:t>
-      </w:r>
-      <w:r>
-        <w:rPr>
-          <w:noProof/>
-        </w:rPr>
-        <w:t>desafios e benefícios. Revista Brasileira de Educação e Tecnologia, v. 13, n. 2, p. 45–58, 2020.</w:t>
-      </w:r>
-    </w:p>
-    <w:p>
-      <w:pPr>
-        <w:rPr>
-          <w:noProof/>
-        </w:rPr>
-      </w:pPr>
-      <w:r>
-        <w:rPr>
-          <w:noProof/>
-        </w:rPr>
-        <w:t xml:space="preserve">DEVMEDIA. </w:t>
-      </w:r>
-      <w:r>
-        <w:rPr>
-          <w:b/>
-          <w:bCs/>
-          <w:noProof/>
-        </w:rPr>
-        <w:t>O que é UML e diagramas de caso de uso:</w:t>
-      </w:r>
-      <w:r>
-        <w:rPr>
-          <w:noProof/>
-        </w:rPr>
-        <w:t xml:space="preserve"> introdução prática à UML. Disponível em: </w:t>
-      </w:r>
-      <w:hyperlink r:id="rId16" w:history="1">
-        <w:r>
-          <w:rPr>
-            <w:noProof/>
-          </w:rPr>
-          <w:t>https://www.devmedia.com.br/o-que-e-uml-e-diagramas-de-caso-de-uso-introducao-pratica-a-uml/23408</w:t>
-        </w:r>
-      </w:hyperlink>
-      <w:r>
-        <w:rPr>
-          <w:noProof/>
-        </w:rPr>
-        <w:t>. Acesso em: 1 jun. 2025.</w:t>
-      </w:r>
-    </w:p>
-    <w:p>
-      <w:pPr>
-        <w:rPr>
-          <w:noProof/>
-        </w:rPr>
-      </w:pPr>
-      <w:r>
-        <w:rPr>
-          <w:noProof/>
-        </w:rPr>
-        <w:t xml:space="preserve">FERREIRA, J. V.; OLIVEIRA, S. R. B.; PORTELA, C. S. </w:t>
-      </w:r>
-      <w:r>
-        <w:rPr>
-          <w:b/>
-          <w:bCs/>
-          <w:noProof/>
-        </w:rPr>
-        <w:t>Experiência do usuário e requisitos não funcionais de software no ensino interdisciplinar de interação humano-computador e Engenharia de Software:</w:t>
-      </w:r>
-      <w:r>
-        <w:rPr>
-          <w:noProof/>
-        </w:rPr>
-        <w:t xml:space="preserve"> uma revisão sistemática da literatura. 2024.</w:t>
-      </w:r>
-    </w:p>
-    <w:p>
-      <w:pPr>
-        <w:rPr>
-          <w:noProof/>
-        </w:rPr>
-      </w:pPr>
-      <w:r>
-        <w:rPr>
-          <w:noProof/>
-        </w:rPr>
-        <w:t xml:space="preserve">KRUCHTEN, P. </w:t>
-      </w:r>
-      <w:r>
-        <w:rPr>
-          <w:b/>
-          <w:bCs/>
-          <w:noProof/>
-        </w:rPr>
-        <w:t>The Rational Unified Process: An Introduction. 3ª ed. Boston:</w:t>
-      </w:r>
-      <w:r>
-        <w:rPr>
-          <w:noProof/>
-        </w:rPr>
-        <w:t xml:space="preserve"> Addison-Wesley, 2004.</w:t>
-      </w:r>
-    </w:p>
-    <w:p>
-      <w:pPr>
-        <w:rPr>
-          <w:noProof/>
-        </w:rPr>
-      </w:pPr>
-      <w:r>
-        <w:rPr>
-          <w:noProof/>
-        </w:rPr>
-        <w:lastRenderedPageBreak/>
-        <w:t xml:space="preserve">LARMAN, C. </w:t>
-      </w:r>
-      <w:r>
-        <w:rPr>
-          <w:b/>
-          <w:bCs/>
-          <w:noProof/>
-        </w:rPr>
-        <w:t>Utilizando UML e padrões: uma introdução à análise e ao projeto orientado a objetos e ao desenvolvimento iterativo. 3ª ed. Porto Alegre:</w:t>
-      </w:r>
-      <w:r>
-        <w:rPr>
-          <w:noProof/>
-        </w:rPr>
-        <w:t xml:space="preserve"> Bookman, 2007.</w:t>
-      </w:r>
-    </w:p>
-    <w:p>
-      <w:pPr>
-        <w:rPr>
-          <w:noProof/>
-        </w:rPr>
-      </w:pPr>
-      <w:r>
-        <w:rPr>
-          <w:noProof/>
-        </w:rPr>
-        <w:t xml:space="preserve">LIMA, J. P.; ANDRADE, S. M. </w:t>
-      </w:r>
-      <w:r>
-        <w:rPr>
-          <w:b/>
-          <w:bCs/>
-          <w:noProof/>
-        </w:rPr>
-        <w:t>Personalização e usabilidade em sistemas institucionais:</w:t>
-      </w:r>
-      <w:r>
-        <w:rPr>
-          <w:noProof/>
-        </w:rPr>
-        <w:t xml:space="preserve"> uma abordagem centrada no usuário. Revista de Sistemas e Tecnologia Educacional, v. 9, n. 1, p. 22–34, 2021.</w:t>
-      </w:r>
-    </w:p>
-    <w:p>
-      <w:pPr>
-        <w:rPr>
-          <w:noProof/>
-        </w:rPr>
-      </w:pPr>
-      <w:r>
-        <w:rPr>
-          <w:noProof/>
-        </w:rPr>
-        <w:t xml:space="preserve">LOPES, L. T. </w:t>
-      </w:r>
-      <w:r>
-        <w:rPr>
-          <w:b/>
-          <w:bCs/>
-          <w:noProof/>
-        </w:rPr>
-        <w:t>Um modelo de processo de engenharia de requisitos para ambientes de desenvolvimento distribuído de software.</w:t>
-      </w:r>
-      <w:r>
-        <w:rPr>
-          <w:noProof/>
-        </w:rPr>
-        <w:t xml:space="preserve"> 142 f. Dissertação (Mestrado em Ciência da Computação) – Pontifícia Universidade Católica do Rio Grande do Sul, Porto Alegre, 2005.</w:t>
-      </w:r>
-    </w:p>
-    <w:p>
-      <w:pPr>
-        <w:rPr>
-          <w:noProof/>
-        </w:rPr>
-      </w:pPr>
-      <w:r>
-        <w:rPr>
-          <w:noProof/>
-        </w:rPr>
-        <w:t xml:space="preserve">MACEDO, L.; MEIRELES, M.; FREITAS, M. A. </w:t>
-      </w:r>
-      <w:r>
-        <w:rPr>
-          <w:b/>
-          <w:bCs/>
-          <w:noProof/>
-        </w:rPr>
-        <w:t>A caracterização do Design Thinking como um modelo de inovação.</w:t>
-      </w:r>
-      <w:r>
-        <w:rPr>
-          <w:noProof/>
-        </w:rPr>
-        <w:t xml:space="preserve"> Revista de Administração e Inovação, v. 12, n. 1, p. 45–69, jan./mar. 2015.</w:t>
-      </w:r>
-    </w:p>
-    <w:p>
-      <w:pPr>
-        <w:rPr>
-          <w:noProof/>
-        </w:rPr>
-      </w:pPr>
-      <w:r>
-        <w:rPr>
-          <w:noProof/>
-        </w:rPr>
-        <w:t xml:space="preserve">MARTINS, L. E. G. </w:t>
-      </w:r>
-      <w:r>
-        <w:rPr>
-          <w:b/>
-          <w:bCs/>
-          <w:noProof/>
-        </w:rPr>
-        <w:t>Uma metodologia de elicitação de requisitos de software baseada na Teoria da Atividade.</w:t>
-      </w:r>
-      <w:r>
-        <w:rPr>
-          <w:noProof/>
-        </w:rPr>
-        <w:t xml:space="preserve"> 186 f. Tese (Doutorado em Engenharia de Sistemas e Computação) – Universidade Federal do Rio de Janeiro, Rio de Janeiro, 2010.</w:t>
-      </w:r>
-    </w:p>
-    <w:p>
-      <w:pPr>
-        <w:rPr>
-          <w:noProof/>
-        </w:rPr>
-      </w:pPr>
-      <w:r>
-        <w:rPr>
-          <w:noProof/>
-        </w:rPr>
-        <w:t>MELO, M. A. F.; BRÄSCHER, M.</w:t>
-      </w:r>
-      <w:r>
-        <w:rPr>
-          <w:b/>
-          <w:bCs/>
-          <w:noProof/>
-        </w:rPr>
-        <w:t xml:space="preserve"> Requisitos Funcionais para Dados de Autoridade Assunto (FRSAD): </w:t>
-      </w:r>
-      <w:r>
-        <w:rPr>
-          <w:noProof/>
-        </w:rPr>
-        <w:t>entidades, atributos e relacionamentos. Revista Brasileira de Biblioteconomia, v. 13, n. 1, p. 1–16, jan./abr. 2019.</w:t>
-      </w:r>
-    </w:p>
-    <w:p>
-      <w:pPr>
-        <w:rPr>
-          <w:noProof/>
-        </w:rPr>
-      </w:pPr>
-      <w:r>
-        <w:rPr>
-          <w:b/>
-          <w:bCs/>
-          <w:noProof/>
-        </w:rPr>
-        <w:t>MORENO, F. P.; ARELLANO, M. Á. M. Requisitos funcionais para registros bibliográficos – FRBR: uma apresentação. Brasília:</w:t>
-      </w:r>
-      <w:r>
-        <w:rPr>
-          <w:noProof/>
-        </w:rPr>
-        <w:t xml:space="preserve"> IBICT, 2008.</w:t>
-      </w:r>
-    </w:p>
-    <w:p>
-      <w:pPr>
-        <w:rPr>
-          <w:noProof/>
-        </w:rPr>
-      </w:pPr>
-      <w:r>
-        <w:rPr>
-          <w:noProof/>
-        </w:rPr>
-        <w:t xml:space="preserve">SANTOS, L. M. </w:t>
-      </w:r>
-      <w:r>
-        <w:rPr>
-          <w:b/>
-          <w:bCs/>
-          <w:noProof/>
-        </w:rPr>
-        <w:t>Rational Unified Process:</w:t>
-      </w:r>
-      <w:r>
-        <w:rPr>
-          <w:noProof/>
-        </w:rPr>
-        <w:t xml:space="preserve"> Reduzindo riscos nos projetos de software. Revista Brasileira de Engenharia de Software, v. 12, n. 1, p. 45–60, 2010.</w:t>
-      </w:r>
-    </w:p>
-    <w:p>
-      <w:pPr>
-        <w:rPr>
-          <w:noProof/>
-        </w:rPr>
-      </w:pPr>
-      <w:r>
-        <w:rPr>
-          <w:noProof/>
-        </w:rPr>
-        <w:t xml:space="preserve">SEGURA, M. P.; OCHOA, J. M. </w:t>
-      </w:r>
-      <w:r>
-        <w:rPr>
-          <w:b/>
-          <w:bCs/>
-          <w:noProof/>
-        </w:rPr>
-        <w:t>Considerações acerca del Design Thinking y Procesos</w:t>
-      </w:r>
-      <w:r>
-        <w:rPr>
-          <w:noProof/>
-        </w:rPr>
-        <w:t>. Revista Científica General José María Córdova, v. 13, n. 13, p. 131–149, jul./dez. 2015.</w:t>
-      </w:r>
-    </w:p>
-    <w:p>
-      <w:pPr>
-        <w:rPr>
-          <w:noProof/>
-        </w:rPr>
-      </w:pPr>
-      <w:r>
-        <w:rPr>
-          <w:noProof/>
-        </w:rPr>
-        <w:t xml:space="preserve">SILVA, C. M. L.; SANTOS, G.; ROCHA, A. R. C. </w:t>
-      </w:r>
-      <w:r>
-        <w:rPr>
-          <w:b/>
-          <w:bCs/>
-          <w:noProof/>
-        </w:rPr>
-        <w:t>Uso do sistema de gerenciamento de fluxo de trabalho para apoiar o desenvolvimento de software baseado no processo unificado da Rational estendido para alcançar os níveis 2 e 3 do modelo de maturidade.</w:t>
-      </w:r>
-      <w:r>
-        <w:rPr>
-          <w:noProof/>
-        </w:rPr>
-        <w:t xml:space="preserve"> Journal of Information Systems and Technology Management (JISTEM), v. 3, n. 2, p. 113–136, ago. 2006.</w:t>
-      </w:r>
-    </w:p>
-    <w:p>
-      <w:pPr>
-        <w:rPr>
-          <w:noProof/>
-        </w:rPr>
-      </w:pPr>
-      <w:r>
-        <w:rPr>
-          <w:noProof/>
-        </w:rPr>
-        <w:lastRenderedPageBreak/>
-        <w:t xml:space="preserve">SILVA, M. R.; OLIVEIRA, P. A. </w:t>
-      </w:r>
-      <w:r>
-        <w:rPr>
-          <w:b/>
-          <w:bCs/>
-          <w:noProof/>
-        </w:rPr>
-        <w:t>O estágio supervisionado e sua importância para a formação profissional:</w:t>
-      </w:r>
-      <w:r>
-        <w:rPr>
-          <w:noProof/>
-        </w:rPr>
-        <w:t xml:space="preserve"> uma análise prática. Revista de Educação e Prática Profissional, v. 7, n. 1, p. 55–66, 2018.</w:t>
-      </w:r>
-    </w:p>
-    <w:p>
-      <w:pPr>
-        <w:rPr>
-          <w:noProof/>
-        </w:rPr>
-      </w:pPr>
-      <w:r>
-        <w:rPr>
-          <w:noProof/>
-        </w:rPr>
-        <w:t xml:space="preserve">SILVA, R. T. et al. </w:t>
-      </w:r>
-      <w:r>
-        <w:rPr>
-          <w:b/>
-          <w:bCs/>
-          <w:noProof/>
-        </w:rPr>
-        <w:t>Placy: uma solução UI/UX e front-end para a divulgação de informações em estabelecimentos comerciais.</w:t>
-      </w:r>
-      <w:r>
-        <w:rPr>
-          <w:noProof/>
-        </w:rPr>
-        <w:t xml:space="preserve"> Revista Ibero-americana de Humanidades, Ciências e Educação, v. 7, n. 7, p. 1033–1051, jul. 2021.</w:t>
-      </w:r>
-    </w:p>
-    <w:p>
-      <w:pPr>
-        <w:rPr>
-          <w:noProof/>
-        </w:rPr>
-      </w:pPr>
-      <w:r>
-        <w:rPr>
-          <w:noProof/>
-        </w:rPr>
-        <w:t>SOMMERVILLE, I</w:t>
-      </w:r>
-      <w:r>
-        <w:rPr>
-          <w:b/>
-          <w:bCs/>
-          <w:noProof/>
-        </w:rPr>
-        <w:t xml:space="preserve">. Engenharia de software. </w:t>
-      </w:r>
-      <w:r>
-        <w:rPr>
-          <w:noProof/>
-        </w:rPr>
-        <w:t>10ª ed. São Paulo: Pearson Education do Brasil, 2019.</w:t>
-      </w:r>
-    </w:p>
-    <w:p>
-      <w:pPr>
-        <w:rPr>
-          <w:noProof/>
-        </w:rPr>
-      </w:pPr>
-      <w:r>
-        <w:rPr>
-          <w:noProof/>
-        </w:rPr>
-        <w:t xml:space="preserve">SOUZA, R. L. de et al. </w:t>
-      </w:r>
-      <w:r>
-        <w:rPr>
-          <w:b/>
-          <w:bCs/>
-          <w:noProof/>
-        </w:rPr>
-        <w:t>Mentalidade de Design Thinking:</w:t>
-      </w:r>
-      <w:r>
-        <w:rPr>
-          <w:noProof/>
-        </w:rPr>
-        <w:t xml:space="preserve"> desenvolvimento e validação de escala. Revista Pensamento Contemporâneo em Administração, v. 13, n. 1, p. 1–16, jan./abr. 2019.</w:t>
-      </w:r>
-    </w:p>
-    <w:p>
-      <w:pPr>
-        <w:rPr>
-          <w:noProof/>
-        </w:rPr>
-      </w:pPr>
-      <w:r>
-        <w:rPr>
-          <w:noProof/>
-        </w:rPr>
-        <w:t xml:space="preserve">TAVARES, H. C. A. B.; </w:t>
-      </w:r>
-      <w:r>
-        <w:rPr>
-          <w:b/>
-          <w:bCs/>
-          <w:noProof/>
-        </w:rPr>
-        <w:t>CARVALHO, A. E. S.; CASTRO, J. F. B. Medição de Pontos por Função a partir da Especificação de Requisitos.</w:t>
-      </w:r>
-      <w:r>
-        <w:rPr>
-          <w:noProof/>
-        </w:rPr>
-        <w:t xml:space="preserve"> Rio de Janeiro: Serpro; Universidade Federal de Pernambuco, 2002.</w:t>
-      </w:r>
-    </w:p>
-    <w:p>
-      <w:pPr>
-        <w:spacing w:before="0" w:after="0" w:line="240" w:lineRule="auto"/>
-        <w:jc w:val="left"/>
-        <w:rPr>
-          <w:rFonts w:eastAsia="Times New Roman"/>
-          <w:b/>
-          <w:bCs/>
-          <w:caps/>
-          <w:sz w:val="28"/>
-          <w:szCs w:val="28"/>
-        </w:rPr>
-      </w:pPr>
-      <w:r>
-        <w:br w:type="page"/>
-      </w:r>
-    </w:p>
-    <w:bookmarkEnd w:id="24"/>
-    <w:bookmarkEnd w:id="25"/>
-    <w:bookmarkEnd w:id="26"/>
-    <w:bookmarkEnd w:id="27"/>
-    <w:bookmarkEnd w:id="28"/>
-    <w:bookmarkEnd w:id="29"/>
-    <w:bookmarkEnd w:id="30"/>
-    <w:bookmarkEnd w:id="31"/>
-    <w:bookmarkEnd w:id="32"/>
-    <w:bookmarkEnd w:id="33"/>
-    <w:bookmarkEnd w:id="34"/>
-    <w:bookmarkEnd w:id="35"/>
-    <w:bookmarkEnd w:id="36"/>
-    <w:bookmarkEnd w:id="68"/>
-    <w:bookmarkEnd w:id="69"/>
-    <w:bookmarkEnd w:id="70"/>
-    <w:p/>
+    <w:bookmarkEnd w:id="70" w:displacedByCustomXml="prev"/>
+    <w:bookmarkEnd w:id="69" w:displacedByCustomXml="prev"/>
+    <w:bookmarkEnd w:id="68" w:displacedByCustomXml="prev"/>
+    <w:bookmarkEnd w:id="36" w:displacedByCustomXml="prev"/>
+    <w:bookmarkEnd w:id="35" w:displacedByCustomXml="prev"/>
+    <w:bookmarkEnd w:id="34" w:displacedByCustomXml="prev"/>
+    <w:bookmarkEnd w:id="33" w:displacedByCustomXml="prev"/>
+    <w:bookmarkEnd w:id="32" w:displacedByCustomXml="prev"/>
+    <w:bookmarkEnd w:id="31" w:displacedByCustomXml="prev"/>
+    <w:bookmarkEnd w:id="30" w:displacedByCustomXml="prev"/>
+    <w:bookmarkEnd w:id="29" w:displacedByCustomXml="prev"/>
+    <w:bookmarkEnd w:id="28" w:displacedByCustomXml="prev"/>
+    <w:bookmarkEnd w:id="27" w:displacedByCustomXml="prev"/>
+    <w:bookmarkEnd w:id="26" w:displacedByCustomXml="prev"/>
+    <w:bookmarkEnd w:id="25" w:displacedByCustomXml="prev"/>
+    <w:bookmarkEnd w:id="24" w:displacedByCustomXml="prev"/>
     <w:sectPr>
       <w:footerReference w:type="default" r:id="rId17"/>
       <w:pgSz w:w="11906" w:h="16838" w:code="9"/>
@@ -16518,6 +16729,7 @@
   <w:style w:type="character" w:default="1" w:styleId="Fontepargpadro">
     <w:name w:val="Default Paragraph Font"/>
     <w:uiPriority w:val="1"/>
+    <w:semiHidden/>
     <w:unhideWhenUsed/>
   </w:style>
   <w:style w:type="table" w:default="1" w:styleId="Tabelanormal">
@@ -18002,7 +18214,7 @@
 </file>
 
 <file path=customXml/item1.xml><?xml version="1.0" encoding="utf-8"?>
-<b:Sources xmlns:b="http://schemas.openxmlformats.org/officeDocument/2006/bibliography" xmlns="http://schemas.openxmlformats.org/officeDocument/2006/bibliography" SelectedStyle="\abnt6023.XSL" StyleName="APA" Version="1">
+<b:Sources xmlns:b="http://schemas.openxmlformats.org/officeDocument/2006/bibliography" xmlns="http://schemas.openxmlformats.org/officeDocument/2006/bibliography" SelectedStyle="\ABNT_Author.XSL" StyleName="ABNT NBR 14724:2025 - Author" Version="4">
   <b:Source>
     <b:Tag>Rog15</b:Tag>
     <b:SourceType>Book</b:SourceType>
@@ -18131,7 +18343,7 @@
 </file>
 
 <file path=customXml/itemProps1.xml><?xml version="1.0" encoding="utf-8"?>
-<ds:datastoreItem xmlns:ds="http://schemas.openxmlformats.org/officeDocument/2006/customXml" ds:itemID="{E370B2E9-5B75-45B7-9B38-55AAD63A0E0A}">
+<ds:datastoreItem xmlns:ds="http://schemas.openxmlformats.org/officeDocument/2006/customXml" ds:itemID="{42728253-C792-415D-9179-D260C6B7136E}">
   <ds:schemaRefs>
     <ds:schemaRef ds:uri="http://schemas.openxmlformats.org/officeDocument/2006/bibliography"/>
   </ds:schemaRefs>

</xml_diff>